<commit_message>
docs(report): correct team contributions by actual authorship
Section 10 only: Maheep - lexer, parser, V2, interpreter and AST evaluator (V3), human
blind set (pending); Aditya - suggestions (N4), lexer/parser/verifier test suites
including the verifier mutation tests, paraphrase set, demo script and presenter guide;
Ashwin - core pipeline, integration, V3/N4 fixes, evaluation runner, metrics, ablations,
mutation operators and mutation-detection evaluation. Removes the sentence about the
interpreter's committing account. Word file regenerated.
</commit_message>
<xml_diff>
--- a/docs/Parsley_Report.docx
+++ b/docs/Parsley_Report.docx
@@ -9455,7 +9455,7 @@
         <w:t xml:space="preserve">Ashwin Lakshminarasimhan.</w:t>
       </w:r>
       <w:r>
-        <w:t xml:space="preserve"> Core pipeline and integration, Phases 0 to 6: project setup, language specification and data contracts, the NLP front end (normalizer, pattern table, candidate generator), IR builder, semantic analysis and session, code generation and back-translation (V1), the CLI, the context resolver (N1) and the ambiguity gate (N2). Verification integration in the pipeline, and the evaluation runner (N5).</w:t>
+        <w:t xml:space="preserve"> Core pipeline and integration, Phases 0 to 6: project setup, language specification and data contracts, the NLP front end (normalizer, pattern table, candidate generator), IR builder, semantic analysis and session, code generation and back-translation (V1), the CLI, the context resolver (N1) and the ambiguity gate (N2). Integration of the verifier layers into the pipeline and the V3 and N4 fixes. The evaluation (N5): runner, metrics and ablations, and the mutation operators and mutation-detection evaluation.</w:t>
       </w:r>
     </w:p>
     <w:p>
@@ -9475,7 +9475,7 @@
         <w:t xml:space="preserve">Aditya Kishor.</w:t>
       </w:r>
       <w:r>
-        <w:t xml:space="preserve"> Lexer and parser, round-trip check (V2), interpreter (V3), suggestions (N4), the held-out paraphrase set and the demonstration script. The interpreter was committed from Maheep Singh's account, so the repository history shows that account as its committer.</w:t>
+        <w:t xml:space="preserve"> Suggestions (N4); the test suites for the lexer, parser and verifiers, including the verifier mutation tests; the held-out paraphrase set; the demonstration script and presenter guide.</w:t>
       </w:r>
     </w:p>
     <w:p>
@@ -9495,7 +9495,7 @@
         <w:t xml:space="preserve">Maheep Singh.</w:t>
       </w:r>
       <w:r>
-        <w:t xml:space="preserve"> AST evaluator (V3), mutation tests and the human blind set.</w:t>
+        <w:t xml:space="preserve"> Lexer and parser, round-trip check (V2), interpreter and AST evaluator (V3), and the human blind test set (pending).</w:t>
       </w:r>
     </w:p>
     <w:p>

</xml_diff>

<commit_message>
Add synthetic blind evaluation set and finalize report
</commit_message>
<xml_diff>
--- a/docs/Parsley_Report.docx
+++ b/docs/Parsley_Report.docx
@@ -9210,26 +9210,16 @@
         <w:pStyle w:val="Heading2"/>
       </w:pPr>
       <w:r>
-        <w:t xml:space="preserve">8.7 Human blind set</w:t>
-      </w:r>
-    </w:p>
-    <w:p>
-      <w:pPr>
-        <w:pBdr>
-          <w:left w:val="single" w:color="E0A800" w:sz="24" w:space="8"/>
-        </w:pBdr>
-        <w:shd w:fill="FFF4CC" w:color="auto" w:val="clear"/>
-        <w:spacing w:after="120" w:before="120"/>
-      </w:pPr>
-      <w:r>
-        <w:rPr>
-          <w:b/>
-          <w:bCs/>
-        </w:rPr>
-        <w:t xml:space="preserve">PLACEHOLDER: human blind set results.</w:t>
-      </w:r>
-      <w:r>
-        <w:t xml:space="preserve"> This subsection is reserved for the optional set </w:t>
+        <w:t xml:space="preserve">8.7 Synthetic blind evaluation set</w:t>
+      </w:r>
+    </w:p>
+    <w:p>
+      <w:pPr>
+        <w:spacing w:after="120"/>
+        <w:jc w:val="both"/>
+      </w:pPr>
+      <w:r>
+        <w:t xml:space="preserve">A 25-case blind set (</w:t>
       </w:r>
       <w:r>
         <w:rPr>
@@ -9237,10 +9227,10 @@
           <w:sz w:val="20"/>
           <w:szCs w:val="20"/>
         </w:rPr>
-        <w:t xml:space="preserve">tests/eval_data/human_blind.json</w:t>
-      </w:r>
-      <w:r>
-        <w:t xml:space="preserve">, written by someone who has not seen the code (format in TESTING.md). When the file is added, </w:t>
+        <w:t xml:space="preserve">tests/eval_data/synthetic_blind.json</w:t>
+      </w:r>
+      <w:r>
+        <w:t xml:space="preserve">, frozen with SHA-256 before its first run) covering declarations, assignment, arithmetic, conditionals, repetition, pronouns and context, ambiguity and unsupported input. No independently human-authored blind set was collected. The results below are copied from the "Synthetic blind set" section of </w:t>
       </w:r>
       <w:r>
         <w:rPr>
@@ -9248,29 +9238,10 @@
           <w:sz w:val="20"/>
           <w:szCs w:val="20"/>
         </w:rPr>
-        <w:t xml:space="preserve">run_eval</w:t>
-      </w:r>
-      <w:r>
-        <w:t xml:space="preserve"> reports it in the "Human blind set" section of </w:t>
-      </w:r>
-      <w:r>
-        <w:rPr>
-          <w:rFonts w:ascii="Consolas" w:cs="Consolas" w:eastAsia="Consolas" w:hAnsi="Consolas"/>
-          <w:sz w:val="20"/>
-          <w:szCs w:val="20"/>
-        </w:rPr>
         <w:t xml:space="preserve">results/summary.md</w:t>
       </w:r>
       <w:r>
-        <w:t xml:space="preserve">, outside the headline numbers above; copy that section's tables here. At the time of writing the file does not exist and the summary reads "Not provided". No results are claimed for this set.</w:t>
-      </w:r>
-    </w:p>
-    <w:p>
-      <w:pPr>
-        <w:pStyle w:val="Heading2"/>
-      </w:pPr>
-      <w:r>
-        <w:t xml:space="preserve">8.8 Development fixtures (sanity check)</w:t>
+        <w:t xml:space="preserve">.</w:t>
       </w:r>
     </w:p>
     <w:p>
@@ -9279,16 +9250,2127 @@
         <w:jc w:val="both"/>
       </w:pPr>
       <w:r>
-        <w:t xml:space="preserve">On the development fixtures, which the system was built against, every metric was at its best value at baseline (for example exact match 23/23 and ambiguity recall 17/17). The ablations moved in the same direction as on the held-out set: exact match fell to 11/23 (47.8%) with N1 off, and wrong code rose to 11/62 (17.7%) under forced top-1. These numbers are not evidence; they only confirm that the runner and the system agree with the tests.</w:t>
-      </w:r>
-    </w:p>
-    <w:p>
-      <w:pPr>
-        <w:pStyle w:val="Heading1"/>
-      </w:pPr>
-      <w:r>
-        <w:t xml:space="preserve">9. Limitations</w:t>
-      </w:r>
+        <w:t xml:space="preserve">Provenance: Synthetic: written by the AI coding agent that helped build this system; not independently human-authored.</w:t>
+      </w:r>
+    </w:p>
+    <w:p>
+      <w:pPr>
+        <w:spacing w:after="120"/>
+        <w:jc w:val="both"/>
+      </w:pPr>
+      <w:r>
+        <w:t xml:space="preserve">Not written by a person; kept out of the held-out numbers above.</w:t>
+      </w:r>
+    </w:p>
+    <w:tbl>
+      <w:tblPr>
+        <w:tblW w:type="dxa" w:w="9026"/>
+        <w:tblBorders>
+          <w:top w:val="single" w:color="auto" w:sz="4"/>
+          <w:left w:val="single" w:color="auto" w:sz="4"/>
+          <w:bottom w:val="single" w:color="auto" w:sz="4"/>
+          <w:right w:val="single" w:color="auto" w:sz="4"/>
+          <w:insideH w:val="single" w:color="auto" w:sz="4"/>
+          <w:insideV w:val="single" w:color="auto" w:sz="4"/>
+        </w:tblBorders>
+        <w:tblLayout w:type="fixed"/>
+      </w:tblPr>
+      <w:tblGrid>
+        <w:gridCol w:w="4255"/>
+        <w:gridCol w:w="1805"/>
+        <w:gridCol w:w="2966"/>
+      </w:tblGrid>
+      <w:tr>
+        <w:trPr>
+          <w:tblHeader/>
+        </w:trPr>
+        <w:tc>
+          <w:tcPr>
+            <w:tcW w:type="dxa" w:w="4255"/>
+            <w:tcBorders>
+              <w:top w:val="single" w:color="BFBFBF" w:sz="4"/>
+              <w:left w:val="single" w:color="BFBFBF" w:sz="4"/>
+              <w:bottom w:val="single" w:color="BFBFBF" w:sz="4"/>
+              <w:right w:val="single" w:color="BFBFBF" w:sz="4"/>
+            </w:tcBorders>
+            <w:shd w:fill="E8EEF7" w:color="auto" w:val="clear"/>
+            <w:tcMar>
+              <w:top w:type="dxa" w:w="40"/>
+              <w:left w:type="dxa" w:w="80"/>
+              <w:bottom w:type="dxa" w:w="40"/>
+              <w:right w:type="dxa" w:w="80"/>
+            </w:tcMar>
+          </w:tcPr>
+          <w:p>
+            <w:pPr>
+              <w:spacing w:after="0"/>
+            </w:pPr>
+            <w:r>
+              <w:rPr>
+                <w:b/>
+                <w:bCs/>
+                <w:sz w:val="18"/>
+                <w:szCs w:val="18"/>
+              </w:rPr>
+              <w:t xml:space="preserve">Metric</w:t>
+            </w:r>
+          </w:p>
+        </w:tc>
+        <w:tc>
+          <w:tcPr>
+            <w:tcW w:type="dxa" w:w="1805"/>
+            <w:tcBorders>
+              <w:top w:val="single" w:color="BFBFBF" w:sz="4"/>
+              <w:left w:val="single" w:color="BFBFBF" w:sz="4"/>
+              <w:bottom w:val="single" w:color="BFBFBF" w:sz="4"/>
+              <w:right w:val="single" w:color="BFBFBF" w:sz="4"/>
+            </w:tcBorders>
+            <w:shd w:fill="E8EEF7" w:color="auto" w:val="clear"/>
+            <w:tcMar>
+              <w:top w:type="dxa" w:w="40"/>
+              <w:left w:type="dxa" w:w="80"/>
+              <w:bottom w:type="dxa" w:w="40"/>
+              <w:right w:type="dxa" w:w="80"/>
+            </w:tcMar>
+          </w:tcPr>
+          <w:p>
+            <w:pPr>
+              <w:spacing w:after="0"/>
+            </w:pPr>
+            <w:r>
+              <w:rPr>
+                <w:b/>
+                <w:bCs/>
+                <w:sz w:val="18"/>
+                <w:szCs w:val="18"/>
+              </w:rPr>
+              <w:t xml:space="preserve">Result</w:t>
+            </w:r>
+          </w:p>
+        </w:tc>
+        <w:tc>
+          <w:tcPr>
+            <w:tcW w:type="dxa" w:w="2966"/>
+            <w:tcBorders>
+              <w:top w:val="single" w:color="BFBFBF" w:sz="4"/>
+              <w:left w:val="single" w:color="BFBFBF" w:sz="4"/>
+              <w:bottom w:val="single" w:color="BFBFBF" w:sz="4"/>
+              <w:right w:val="single" w:color="BFBFBF" w:sz="4"/>
+            </w:tcBorders>
+            <w:shd w:fill="E8EEF7" w:color="auto" w:val="clear"/>
+            <w:tcMar>
+              <w:top w:type="dxa" w:w="40"/>
+              <w:left w:type="dxa" w:w="80"/>
+              <w:bottom w:type="dxa" w:w="40"/>
+              <w:right w:type="dxa" w:w="80"/>
+            </w:tcMar>
+          </w:tcPr>
+          <w:p>
+            <w:pPr>
+              <w:spacing w:after="0"/>
+            </w:pPr>
+            <w:r>
+              <w:rPr>
+                <w:b/>
+                <w:bCs/>
+                <w:sz w:val="18"/>
+                <w:szCs w:val="18"/>
+              </w:rPr>
+              <w:t xml:space="preserve">Over</w:t>
+            </w:r>
+          </w:p>
+        </w:tc>
+      </w:tr>
+      <w:tr>
+        <w:trPr>
+          <w:tblHeader w:val="off"/>
+        </w:trPr>
+        <w:tc>
+          <w:tcPr>
+            <w:tcW w:type="dxa" w:w="4255"/>
+            <w:tcBorders>
+              <w:top w:val="single" w:color="BFBFBF" w:sz="4"/>
+              <w:left w:val="single" w:color="BFBFBF" w:sz="4"/>
+              <w:bottom w:val="single" w:color="BFBFBF" w:sz="4"/>
+              <w:right w:val="single" w:color="BFBFBF" w:sz="4"/>
+            </w:tcBorders>
+            <w:tcMar>
+              <w:top w:type="dxa" w:w="40"/>
+              <w:left w:type="dxa" w:w="80"/>
+              <w:bottom w:type="dxa" w:w="40"/>
+              <w:right w:type="dxa" w:w="80"/>
+            </w:tcMar>
+          </w:tcPr>
+          <w:p>
+            <w:pPr>
+              <w:spacing w:after="0"/>
+            </w:pPr>
+            <w:r>
+              <w:rPr>
+                <w:sz w:val="18"/>
+                <w:szCs w:val="18"/>
+              </w:rPr>
+              <w:t xml:space="preserve">exact-match accuracy</w:t>
+            </w:r>
+          </w:p>
+        </w:tc>
+        <w:tc>
+          <w:tcPr>
+            <w:tcW w:type="dxa" w:w="1805"/>
+            <w:tcBorders>
+              <w:top w:val="single" w:color="BFBFBF" w:sz="4"/>
+              <w:left w:val="single" w:color="BFBFBF" w:sz="4"/>
+              <w:bottom w:val="single" w:color="BFBFBF" w:sz="4"/>
+              <w:right w:val="single" w:color="BFBFBF" w:sz="4"/>
+            </w:tcBorders>
+            <w:tcMar>
+              <w:top w:type="dxa" w:w="40"/>
+              <w:left w:type="dxa" w:w="80"/>
+              <w:bottom w:type="dxa" w:w="40"/>
+              <w:right w:type="dxa" w:w="80"/>
+            </w:tcMar>
+          </w:tcPr>
+          <w:p>
+            <w:pPr>
+              <w:spacing w:after="0"/>
+            </w:pPr>
+            <w:r>
+              <w:rPr>
+                <w:sz w:val="18"/>
+                <w:szCs w:val="18"/>
+              </w:rPr>
+              <w:t xml:space="preserve">19/19 (100.0%)</w:t>
+            </w:r>
+          </w:p>
+        </w:tc>
+        <w:tc>
+          <w:tcPr>
+            <w:tcW w:type="dxa" w:w="2966"/>
+            <w:tcBorders>
+              <w:top w:val="single" w:color="BFBFBF" w:sz="4"/>
+              <w:left w:val="single" w:color="BFBFBF" w:sz="4"/>
+              <w:bottom w:val="single" w:color="BFBFBF" w:sz="4"/>
+              <w:right w:val="single" w:color="BFBFBF" w:sz="4"/>
+            </w:tcBorders>
+            <w:tcMar>
+              <w:top w:type="dxa" w:w="40"/>
+              <w:left w:type="dxa" w:w="80"/>
+              <w:bottom w:type="dxa" w:w="40"/>
+              <w:right w:type="dxa" w:w="80"/>
+            </w:tcMar>
+          </w:tcPr>
+          <w:p>
+            <w:pPr>
+              <w:spacing w:after="0"/>
+            </w:pPr>
+            <w:r>
+              <w:rPr>
+                <w:sz w:val="18"/>
+                <w:szCs w:val="18"/>
+              </w:rPr>
+              <w:t xml:space="preserve">synthetic_blind</w:t>
+            </w:r>
+          </w:p>
+        </w:tc>
+      </w:tr>
+      <w:tr>
+        <w:trPr>
+          <w:tblHeader w:val="off"/>
+        </w:trPr>
+        <w:tc>
+          <w:tcPr>
+            <w:tcW w:type="dxa" w:w="4255"/>
+            <w:tcBorders>
+              <w:top w:val="single" w:color="BFBFBF" w:sz="4"/>
+              <w:left w:val="single" w:color="BFBFBF" w:sz="4"/>
+              <w:bottom w:val="single" w:color="BFBFBF" w:sz="4"/>
+              <w:right w:val="single" w:color="BFBFBF" w:sz="4"/>
+            </w:tcBorders>
+            <w:tcMar>
+              <w:top w:type="dxa" w:w="40"/>
+              <w:left w:type="dxa" w:w="80"/>
+              <w:bottom w:type="dxa" w:w="40"/>
+              <w:right w:type="dxa" w:w="80"/>
+            </w:tcMar>
+          </w:tcPr>
+          <w:p>
+            <w:pPr>
+              <w:spacing w:after="0"/>
+            </w:pPr>
+            <w:r>
+              <w:rPr>
+                <w:sz w:val="18"/>
+                <w:szCs w:val="18"/>
+              </w:rPr>
+              <w:t xml:space="preserve">exact-match accuracy</w:t>
+            </w:r>
+          </w:p>
+        </w:tc>
+        <w:tc>
+          <w:tcPr>
+            <w:tcW w:type="dxa" w:w="1805"/>
+            <w:tcBorders>
+              <w:top w:val="single" w:color="BFBFBF" w:sz="4"/>
+              <w:left w:val="single" w:color="BFBFBF" w:sz="4"/>
+              <w:bottom w:val="single" w:color="BFBFBF" w:sz="4"/>
+              <w:right w:val="single" w:color="BFBFBF" w:sz="4"/>
+            </w:tcBorders>
+            <w:tcMar>
+              <w:top w:type="dxa" w:w="40"/>
+              <w:left w:type="dxa" w:w="80"/>
+              <w:bottom w:type="dxa" w:w="40"/>
+              <w:right w:type="dxa" w:w="80"/>
+            </w:tcMar>
+          </w:tcPr>
+          <w:p>
+            <w:pPr>
+              <w:spacing w:after="0"/>
+            </w:pPr>
+            <w:r>
+              <w:rPr>
+                <w:sz w:val="18"/>
+                <w:szCs w:val="18"/>
+              </w:rPr>
+              <w:t xml:space="preserve">19/19 (100.0%)</w:t>
+            </w:r>
+          </w:p>
+        </w:tc>
+        <w:tc>
+          <w:tcPr>
+            <w:tcW w:type="dxa" w:w="2966"/>
+            <w:tcBorders>
+              <w:top w:val="single" w:color="BFBFBF" w:sz="4"/>
+              <w:left w:val="single" w:color="BFBFBF" w:sz="4"/>
+              <w:bottom w:val="single" w:color="BFBFBF" w:sz="4"/>
+              <w:right w:val="single" w:color="BFBFBF" w:sz="4"/>
+            </w:tcBorders>
+            <w:tcMar>
+              <w:top w:type="dxa" w:w="40"/>
+              <w:left w:type="dxa" w:w="80"/>
+              <w:bottom w:type="dxa" w:w="40"/>
+              <w:right w:type="dxa" w:w="80"/>
+            </w:tcMar>
+          </w:tcPr>
+          <w:p>
+            <w:pPr>
+              <w:spacing w:after="0"/>
+            </w:pPr>
+            <w:r>
+              <w:rPr>
+                <w:sz w:val="18"/>
+                <w:szCs w:val="18"/>
+              </w:rPr>
+              <w:t xml:space="preserve">all with gold code</w:t>
+            </w:r>
+          </w:p>
+        </w:tc>
+      </w:tr>
+      <w:tr>
+        <w:trPr>
+          <w:tblHeader w:val="off"/>
+        </w:trPr>
+        <w:tc>
+          <w:tcPr>
+            <w:tcW w:type="dxa" w:w="4255"/>
+            <w:tcBorders>
+              <w:top w:val="single" w:color="BFBFBF" w:sz="4"/>
+              <w:left w:val="single" w:color="BFBFBF" w:sz="4"/>
+              <w:bottom w:val="single" w:color="BFBFBF" w:sz="4"/>
+              <w:right w:val="single" w:color="BFBFBF" w:sz="4"/>
+            </w:tcBorders>
+            <w:tcMar>
+              <w:top w:type="dxa" w:w="40"/>
+              <w:left w:type="dxa" w:w="80"/>
+              <w:bottom w:type="dxa" w:w="40"/>
+              <w:right w:type="dxa" w:w="80"/>
+            </w:tcMar>
+          </w:tcPr>
+          <w:p>
+            <w:pPr>
+              <w:spacing w:after="0"/>
+            </w:pPr>
+            <w:r>
+              <w:rPr>
+                <w:sz w:val="18"/>
+                <w:szCs w:val="18"/>
+              </w:rPr>
+              <w:t xml:space="preserve">paraphrase consistency (same AST)</w:t>
+            </w:r>
+          </w:p>
+        </w:tc>
+        <w:tc>
+          <w:tcPr>
+            <w:tcW w:type="dxa" w:w="1805"/>
+            <w:tcBorders>
+              <w:top w:val="single" w:color="BFBFBF" w:sz="4"/>
+              <w:left w:val="single" w:color="BFBFBF" w:sz="4"/>
+              <w:bottom w:val="single" w:color="BFBFBF" w:sz="4"/>
+              <w:right w:val="single" w:color="BFBFBF" w:sz="4"/>
+            </w:tcBorders>
+            <w:tcMar>
+              <w:top w:type="dxa" w:w="40"/>
+              <w:left w:type="dxa" w:w="80"/>
+              <w:bottom w:type="dxa" w:w="40"/>
+              <w:right w:type="dxa" w:w="80"/>
+            </w:tcMar>
+          </w:tcPr>
+          <w:p>
+            <w:pPr>
+              <w:spacing w:after="0"/>
+            </w:pPr>
+            <w:r>
+              <w:rPr>
+                <w:sz w:val="18"/>
+                <w:szCs w:val="18"/>
+              </w:rPr>
+              <w:t xml:space="preserve">n/a (no items)</w:t>
+            </w:r>
+          </w:p>
+        </w:tc>
+        <w:tc>
+          <w:tcPr>
+            <w:tcW w:type="dxa" w:w="2966"/>
+            <w:tcBorders>
+              <w:top w:val="single" w:color="BFBFBF" w:sz="4"/>
+              <w:left w:val="single" w:color="BFBFBF" w:sz="4"/>
+              <w:bottom w:val="single" w:color="BFBFBF" w:sz="4"/>
+              <w:right w:val="single" w:color="BFBFBF" w:sz="4"/>
+            </w:tcBorders>
+            <w:tcMar>
+              <w:top w:type="dxa" w:w="40"/>
+              <w:left w:type="dxa" w:w="80"/>
+              <w:bottom w:type="dxa" w:w="40"/>
+              <w:right w:type="dxa" w:w="80"/>
+            </w:tcMar>
+          </w:tcPr>
+          <w:p>
+            <w:pPr>
+              <w:spacing w:after="0"/>
+            </w:pPr>
+            <w:r>
+              <w:rPr>
+                <w:sz w:val="18"/>
+                <w:szCs w:val="18"/>
+              </w:rPr>
+              <w:t xml:space="preserve">paraphrase</w:t>
+            </w:r>
+          </w:p>
+        </w:tc>
+      </w:tr>
+      <w:tr>
+        <w:trPr>
+          <w:tblHeader w:val="off"/>
+        </w:trPr>
+        <w:tc>
+          <w:tcPr>
+            <w:tcW w:type="dxa" w:w="4255"/>
+            <w:tcBorders>
+              <w:top w:val="single" w:color="BFBFBF" w:sz="4"/>
+              <w:left w:val="single" w:color="BFBFBF" w:sz="4"/>
+              <w:bottom w:val="single" w:color="BFBFBF" w:sz="4"/>
+              <w:right w:val="single" w:color="BFBFBF" w:sz="4"/>
+            </w:tcBorders>
+            <w:tcMar>
+              <w:top w:type="dxa" w:w="40"/>
+              <w:left w:type="dxa" w:w="80"/>
+              <w:bottom w:type="dxa" w:w="40"/>
+              <w:right w:type="dxa" w:w="80"/>
+            </w:tcMar>
+          </w:tcPr>
+          <w:p>
+            <w:pPr>
+              <w:spacing w:after="0"/>
+            </w:pPr>
+            <w:r>
+              <w:rPr>
+                <w:sz w:val="18"/>
+                <w:szCs w:val="18"/>
+              </w:rPr>
+              <w:t xml:space="preserve">paraphrase consistency (gold AST)</w:t>
+            </w:r>
+          </w:p>
+        </w:tc>
+        <w:tc>
+          <w:tcPr>
+            <w:tcW w:type="dxa" w:w="1805"/>
+            <w:tcBorders>
+              <w:top w:val="single" w:color="BFBFBF" w:sz="4"/>
+              <w:left w:val="single" w:color="BFBFBF" w:sz="4"/>
+              <w:bottom w:val="single" w:color="BFBFBF" w:sz="4"/>
+              <w:right w:val="single" w:color="BFBFBF" w:sz="4"/>
+            </w:tcBorders>
+            <w:tcMar>
+              <w:top w:type="dxa" w:w="40"/>
+              <w:left w:type="dxa" w:w="80"/>
+              <w:bottom w:type="dxa" w:w="40"/>
+              <w:right w:type="dxa" w:w="80"/>
+            </w:tcMar>
+          </w:tcPr>
+          <w:p>
+            <w:pPr>
+              <w:spacing w:after="0"/>
+            </w:pPr>
+            <w:r>
+              <w:rPr>
+                <w:sz w:val="18"/>
+                <w:szCs w:val="18"/>
+              </w:rPr>
+              <w:t xml:space="preserve">n/a (no items)</w:t>
+            </w:r>
+          </w:p>
+        </w:tc>
+        <w:tc>
+          <w:tcPr>
+            <w:tcW w:type="dxa" w:w="2966"/>
+            <w:tcBorders>
+              <w:top w:val="single" w:color="BFBFBF" w:sz="4"/>
+              <w:left w:val="single" w:color="BFBFBF" w:sz="4"/>
+              <w:bottom w:val="single" w:color="BFBFBF" w:sz="4"/>
+              <w:right w:val="single" w:color="BFBFBF" w:sz="4"/>
+            </w:tcBorders>
+            <w:tcMar>
+              <w:top w:type="dxa" w:w="40"/>
+              <w:left w:type="dxa" w:w="80"/>
+              <w:bottom w:type="dxa" w:w="40"/>
+              <w:right w:type="dxa" w:w="80"/>
+            </w:tcMar>
+          </w:tcPr>
+          <w:p>
+            <w:pPr>
+              <w:spacing w:after="0"/>
+            </w:pPr>
+            <w:r>
+              <w:rPr>
+                <w:sz w:val="18"/>
+                <w:szCs w:val="18"/>
+              </w:rPr>
+              <w:t xml:space="preserve">paraphrase</w:t>
+            </w:r>
+          </w:p>
+        </w:tc>
+      </w:tr>
+      <w:tr>
+        <w:trPr>
+          <w:tblHeader w:val="off"/>
+        </w:trPr>
+        <w:tc>
+          <w:tcPr>
+            <w:tcW w:type="dxa" w:w="4255"/>
+            <w:tcBorders>
+              <w:top w:val="single" w:color="BFBFBF" w:sz="4"/>
+              <w:left w:val="single" w:color="BFBFBF" w:sz="4"/>
+              <w:bottom w:val="single" w:color="BFBFBF" w:sz="4"/>
+              <w:right w:val="single" w:color="BFBFBF" w:sz="4"/>
+            </w:tcBorders>
+            <w:tcMar>
+              <w:top w:type="dxa" w:w="40"/>
+              <w:left w:type="dxa" w:w="80"/>
+              <w:bottom w:type="dxa" w:w="40"/>
+              <w:right w:type="dxa" w:w="80"/>
+            </w:tcMar>
+          </w:tcPr>
+          <w:p>
+            <w:pPr>
+              <w:spacing w:after="0"/>
+            </w:pPr>
+            <w:r>
+              <w:rPr>
+                <w:sz w:val="18"/>
+                <w:szCs w:val="18"/>
+              </w:rPr>
+              <w:t xml:space="preserve">ambiguity precision</w:t>
+            </w:r>
+          </w:p>
+        </w:tc>
+        <w:tc>
+          <w:tcPr>
+            <w:tcW w:type="dxa" w:w="1805"/>
+            <w:tcBorders>
+              <w:top w:val="single" w:color="BFBFBF" w:sz="4"/>
+              <w:left w:val="single" w:color="BFBFBF" w:sz="4"/>
+              <w:bottom w:val="single" w:color="BFBFBF" w:sz="4"/>
+              <w:right w:val="single" w:color="BFBFBF" w:sz="4"/>
+            </w:tcBorders>
+            <w:tcMar>
+              <w:top w:type="dxa" w:w="40"/>
+              <w:left w:type="dxa" w:w="80"/>
+              <w:bottom w:type="dxa" w:w="40"/>
+              <w:right w:type="dxa" w:w="80"/>
+            </w:tcMar>
+          </w:tcPr>
+          <w:p>
+            <w:pPr>
+              <w:spacing w:after="0"/>
+            </w:pPr>
+            <w:r>
+              <w:rPr>
+                <w:sz w:val="18"/>
+                <w:szCs w:val="18"/>
+              </w:rPr>
+              <w:t xml:space="preserve">3/3 (100.0%)</w:t>
+            </w:r>
+          </w:p>
+        </w:tc>
+        <w:tc>
+          <w:tcPr>
+            <w:tcW w:type="dxa" w:w="2966"/>
+            <w:tcBorders>
+              <w:top w:val="single" w:color="BFBFBF" w:sz="4"/>
+              <w:left w:val="single" w:color="BFBFBF" w:sz="4"/>
+              <w:bottom w:val="single" w:color="BFBFBF" w:sz="4"/>
+              <w:right w:val="single" w:color="BFBFBF" w:sz="4"/>
+            </w:tcBorders>
+            <w:tcMar>
+              <w:top w:type="dxa" w:w="40"/>
+              <w:left w:type="dxa" w:w="80"/>
+              <w:bottom w:type="dxa" w:w="40"/>
+              <w:right w:type="dxa" w:w="80"/>
+            </w:tcMar>
+          </w:tcPr>
+          <w:p>
+            <w:pPr>
+              <w:spacing w:after="0"/>
+            </w:pPr>
+            <w:r>
+              <w:rPr>
+                <w:sz w:val="18"/>
+                <w:szCs w:val="18"/>
+              </w:rPr>
+              <w:t xml:space="preserve">all</w:t>
+            </w:r>
+          </w:p>
+        </w:tc>
+      </w:tr>
+      <w:tr>
+        <w:trPr>
+          <w:tblHeader w:val="off"/>
+        </w:trPr>
+        <w:tc>
+          <w:tcPr>
+            <w:tcW w:type="dxa" w:w="4255"/>
+            <w:tcBorders>
+              <w:top w:val="single" w:color="BFBFBF" w:sz="4"/>
+              <w:left w:val="single" w:color="BFBFBF" w:sz="4"/>
+              <w:bottom w:val="single" w:color="BFBFBF" w:sz="4"/>
+              <w:right w:val="single" w:color="BFBFBF" w:sz="4"/>
+            </w:tcBorders>
+            <w:tcMar>
+              <w:top w:type="dxa" w:w="40"/>
+              <w:left w:type="dxa" w:w="80"/>
+              <w:bottom w:type="dxa" w:w="40"/>
+              <w:right w:type="dxa" w:w="80"/>
+            </w:tcMar>
+          </w:tcPr>
+          <w:p>
+            <w:pPr>
+              <w:spacing w:after="0"/>
+            </w:pPr>
+            <w:r>
+              <w:rPr>
+                <w:sz w:val="18"/>
+                <w:szCs w:val="18"/>
+              </w:rPr>
+              <w:t xml:space="preserve">ambiguity recall</w:t>
+            </w:r>
+          </w:p>
+        </w:tc>
+        <w:tc>
+          <w:tcPr>
+            <w:tcW w:type="dxa" w:w="1805"/>
+            <w:tcBorders>
+              <w:top w:val="single" w:color="BFBFBF" w:sz="4"/>
+              <w:left w:val="single" w:color="BFBFBF" w:sz="4"/>
+              <w:bottom w:val="single" w:color="BFBFBF" w:sz="4"/>
+              <w:right w:val="single" w:color="BFBFBF" w:sz="4"/>
+            </w:tcBorders>
+            <w:tcMar>
+              <w:top w:type="dxa" w:w="40"/>
+              <w:left w:type="dxa" w:w="80"/>
+              <w:bottom w:type="dxa" w:w="40"/>
+              <w:right w:type="dxa" w:w="80"/>
+            </w:tcMar>
+          </w:tcPr>
+          <w:p>
+            <w:pPr>
+              <w:spacing w:after="0"/>
+            </w:pPr>
+            <w:r>
+              <w:rPr>
+                <w:sz w:val="18"/>
+                <w:szCs w:val="18"/>
+              </w:rPr>
+              <w:t xml:space="preserve">3/3 (100.0%)</w:t>
+            </w:r>
+          </w:p>
+        </w:tc>
+        <w:tc>
+          <w:tcPr>
+            <w:tcW w:type="dxa" w:w="2966"/>
+            <w:tcBorders>
+              <w:top w:val="single" w:color="BFBFBF" w:sz="4"/>
+              <w:left w:val="single" w:color="BFBFBF" w:sz="4"/>
+              <w:bottom w:val="single" w:color="BFBFBF" w:sz="4"/>
+              <w:right w:val="single" w:color="BFBFBF" w:sz="4"/>
+            </w:tcBorders>
+            <w:tcMar>
+              <w:top w:type="dxa" w:w="40"/>
+              <w:left w:type="dxa" w:w="80"/>
+              <w:bottom w:type="dxa" w:w="40"/>
+              <w:right w:type="dxa" w:w="80"/>
+            </w:tcMar>
+          </w:tcPr>
+          <w:p>
+            <w:pPr>
+              <w:spacing w:after="0"/>
+            </w:pPr>
+            <w:r>
+              <w:rPr>
+                <w:sz w:val="18"/>
+                <w:szCs w:val="18"/>
+              </w:rPr>
+              <w:t xml:space="preserve">ambiguous</w:t>
+            </w:r>
+          </w:p>
+        </w:tc>
+      </w:tr>
+      <w:tr>
+        <w:trPr>
+          <w:tblHeader w:val="off"/>
+        </w:trPr>
+        <w:tc>
+          <w:tcPr>
+            <w:tcW w:type="dxa" w:w="4255"/>
+            <w:tcBorders>
+              <w:top w:val="single" w:color="BFBFBF" w:sz="4"/>
+              <w:left w:val="single" w:color="BFBFBF" w:sz="4"/>
+              <w:bottom w:val="single" w:color="BFBFBF" w:sz="4"/>
+              <w:right w:val="single" w:color="BFBFBF" w:sz="4"/>
+            </w:tcBorders>
+            <w:tcMar>
+              <w:top w:type="dxa" w:w="40"/>
+              <w:left w:type="dxa" w:w="80"/>
+              <w:bottom w:type="dxa" w:w="40"/>
+              <w:right w:type="dxa" w:w="80"/>
+            </w:tcMar>
+          </w:tcPr>
+          <w:p>
+            <w:pPr>
+              <w:spacing w:after="0"/>
+            </w:pPr>
+            <w:r>
+              <w:rPr>
+                <w:sz w:val="18"/>
+                <w:szCs w:val="18"/>
+              </w:rPr>
+              <w:t xml:space="preserve">unnecessary-question rate</w:t>
+            </w:r>
+          </w:p>
+        </w:tc>
+        <w:tc>
+          <w:tcPr>
+            <w:tcW w:type="dxa" w:w="1805"/>
+            <w:tcBorders>
+              <w:top w:val="single" w:color="BFBFBF" w:sz="4"/>
+              <w:left w:val="single" w:color="BFBFBF" w:sz="4"/>
+              <w:bottom w:val="single" w:color="BFBFBF" w:sz="4"/>
+              <w:right w:val="single" w:color="BFBFBF" w:sz="4"/>
+            </w:tcBorders>
+            <w:tcMar>
+              <w:top w:type="dxa" w:w="40"/>
+              <w:left w:type="dxa" w:w="80"/>
+              <w:bottom w:type="dxa" w:w="40"/>
+              <w:right w:type="dxa" w:w="80"/>
+            </w:tcMar>
+          </w:tcPr>
+          <w:p>
+            <w:pPr>
+              <w:spacing w:after="0"/>
+            </w:pPr>
+            <w:r>
+              <w:rPr>
+                <w:sz w:val="18"/>
+                <w:szCs w:val="18"/>
+              </w:rPr>
+              <w:t xml:space="preserve">0/19 (0.0%)</w:t>
+            </w:r>
+          </w:p>
+        </w:tc>
+        <w:tc>
+          <w:tcPr>
+            <w:tcW w:type="dxa" w:w="2966"/>
+            <w:tcBorders>
+              <w:top w:val="single" w:color="BFBFBF" w:sz="4"/>
+              <w:left w:val="single" w:color="BFBFBF" w:sz="4"/>
+              <w:bottom w:val="single" w:color="BFBFBF" w:sz="4"/>
+              <w:right w:val="single" w:color="BFBFBF" w:sz="4"/>
+            </w:tcBorders>
+            <w:tcMar>
+              <w:top w:type="dxa" w:w="40"/>
+              <w:left w:type="dxa" w:w="80"/>
+              <w:bottom w:type="dxa" w:w="40"/>
+              <w:right w:type="dxa" w:w="80"/>
+            </w:tcMar>
+          </w:tcPr>
+          <w:p>
+            <w:pPr>
+              <w:spacing w:after="0"/>
+            </w:pPr>
+            <w:r>
+              <w:rPr>
+                <w:sz w:val="18"/>
+                <w:szCs w:val="18"/>
+              </w:rPr>
+              <w:t xml:space="preserve">expected to compile</w:t>
+            </w:r>
+          </w:p>
+        </w:tc>
+      </w:tr>
+      <w:tr>
+        <w:trPr>
+          <w:tblHeader w:val="off"/>
+        </w:trPr>
+        <w:tc>
+          <w:tcPr>
+            <w:tcW w:type="dxa" w:w="4255"/>
+            <w:tcBorders>
+              <w:top w:val="single" w:color="BFBFBF" w:sz="4"/>
+              <w:left w:val="single" w:color="BFBFBF" w:sz="4"/>
+              <w:bottom w:val="single" w:color="BFBFBF" w:sz="4"/>
+              <w:right w:val="single" w:color="BFBFBF" w:sz="4"/>
+            </w:tcBorders>
+            <w:tcMar>
+              <w:top w:type="dxa" w:w="40"/>
+              <w:left w:type="dxa" w:w="80"/>
+              <w:bottom w:type="dxa" w:w="40"/>
+              <w:right w:type="dxa" w:w="80"/>
+            </w:tcMar>
+          </w:tcPr>
+          <w:p>
+            <w:pPr>
+              <w:spacing w:after="0"/>
+            </w:pPr>
+            <w:r>
+              <w:rPr>
+                <w:sz w:val="18"/>
+                <w:szCs w:val="18"/>
+              </w:rPr>
+              <w:t xml:space="preserve">context-resolution accuracy</w:t>
+            </w:r>
+          </w:p>
+        </w:tc>
+        <w:tc>
+          <w:tcPr>
+            <w:tcW w:type="dxa" w:w="1805"/>
+            <w:tcBorders>
+              <w:top w:val="single" w:color="BFBFBF" w:sz="4"/>
+              <w:left w:val="single" w:color="BFBFBF" w:sz="4"/>
+              <w:bottom w:val="single" w:color="BFBFBF" w:sz="4"/>
+              <w:right w:val="single" w:color="BFBFBF" w:sz="4"/>
+            </w:tcBorders>
+            <w:tcMar>
+              <w:top w:type="dxa" w:w="40"/>
+              <w:left w:type="dxa" w:w="80"/>
+              <w:bottom w:type="dxa" w:w="40"/>
+              <w:right w:type="dxa" w:w="80"/>
+            </w:tcMar>
+          </w:tcPr>
+          <w:p>
+            <w:pPr>
+              <w:spacing w:after="0"/>
+            </w:pPr>
+            <w:r>
+              <w:rPr>
+                <w:sz w:val="18"/>
+                <w:szCs w:val="18"/>
+              </w:rPr>
+              <w:t xml:space="preserve">15/15 (100.0%)</w:t>
+            </w:r>
+          </w:p>
+        </w:tc>
+        <w:tc>
+          <w:tcPr>
+            <w:tcW w:type="dxa" w:w="2966"/>
+            <w:tcBorders>
+              <w:top w:val="single" w:color="BFBFBF" w:sz="4"/>
+              <w:left w:val="single" w:color="BFBFBF" w:sz="4"/>
+              <w:bottom w:val="single" w:color="BFBFBF" w:sz="4"/>
+              <w:right w:val="single" w:color="BFBFBF" w:sz="4"/>
+            </w:tcBorders>
+            <w:tcMar>
+              <w:top w:type="dxa" w:w="40"/>
+              <w:left w:type="dxa" w:w="80"/>
+              <w:bottom w:type="dxa" w:w="40"/>
+              <w:right w:type="dxa" w:w="80"/>
+            </w:tcMar>
+          </w:tcPr>
+          <w:p>
+            <w:pPr>
+              <w:spacing w:after="0"/>
+            </w:pPr>
+            <w:r>
+              <w:rPr>
+                <w:sz w:val="18"/>
+                <w:szCs w:val="18"/>
+              </w:rPr>
+              <w:t xml:space="preserve">context-dependent</w:t>
+            </w:r>
+          </w:p>
+        </w:tc>
+      </w:tr>
+      <w:tr>
+        <w:trPr>
+          <w:tblHeader w:val="off"/>
+        </w:trPr>
+        <w:tc>
+          <w:tcPr>
+            <w:tcW w:type="dxa" w:w="4255"/>
+            <w:tcBorders>
+              <w:top w:val="single" w:color="BFBFBF" w:sz="4"/>
+              <w:left w:val="single" w:color="BFBFBF" w:sz="4"/>
+              <w:bottom w:val="single" w:color="BFBFBF" w:sz="4"/>
+              <w:right w:val="single" w:color="BFBFBF" w:sz="4"/>
+            </w:tcBorders>
+            <w:tcMar>
+              <w:top w:type="dxa" w:w="40"/>
+              <w:left w:type="dxa" w:w="80"/>
+              <w:bottom w:type="dxa" w:w="40"/>
+              <w:right w:type="dxa" w:w="80"/>
+            </w:tcMar>
+          </w:tcPr>
+          <w:p>
+            <w:pPr>
+              <w:spacing w:after="0"/>
+            </w:pPr>
+            <w:r>
+              <w:rPr>
+                <w:sz w:val="18"/>
+                <w:szCs w:val="18"/>
+              </w:rPr>
+              <w:t xml:space="preserve">safe-rejection rate</w:t>
+            </w:r>
+          </w:p>
+        </w:tc>
+        <w:tc>
+          <w:tcPr>
+            <w:tcW w:type="dxa" w:w="1805"/>
+            <w:tcBorders>
+              <w:top w:val="single" w:color="BFBFBF" w:sz="4"/>
+              <w:left w:val="single" w:color="BFBFBF" w:sz="4"/>
+              <w:bottom w:val="single" w:color="BFBFBF" w:sz="4"/>
+              <w:right w:val="single" w:color="BFBFBF" w:sz="4"/>
+            </w:tcBorders>
+            <w:tcMar>
+              <w:top w:type="dxa" w:w="40"/>
+              <w:left w:type="dxa" w:w="80"/>
+              <w:bottom w:type="dxa" w:w="40"/>
+              <w:right w:type="dxa" w:w="80"/>
+            </w:tcMar>
+          </w:tcPr>
+          <w:p>
+            <w:pPr>
+              <w:spacing w:after="0"/>
+            </w:pPr>
+            <w:r>
+              <w:rPr>
+                <w:sz w:val="18"/>
+                <w:szCs w:val="18"/>
+              </w:rPr>
+              <w:t xml:space="preserve">3/3 (100.0%)</w:t>
+            </w:r>
+          </w:p>
+        </w:tc>
+        <w:tc>
+          <w:tcPr>
+            <w:tcW w:type="dxa" w:w="2966"/>
+            <w:tcBorders>
+              <w:top w:val="single" w:color="BFBFBF" w:sz="4"/>
+              <w:left w:val="single" w:color="BFBFBF" w:sz="4"/>
+              <w:bottom w:val="single" w:color="BFBFBF" w:sz="4"/>
+              <w:right w:val="single" w:color="BFBFBF" w:sz="4"/>
+            </w:tcBorders>
+            <w:tcMar>
+              <w:top w:type="dxa" w:w="40"/>
+              <w:left w:type="dxa" w:w="80"/>
+              <w:bottom w:type="dxa" w:w="40"/>
+              <w:right w:type="dxa" w:w="80"/>
+            </w:tcMar>
+          </w:tcPr>
+          <w:p>
+            <w:pPr>
+              <w:spacing w:after="0"/>
+            </w:pPr>
+            <w:r>
+              <w:rPr>
+                <w:sz w:val="18"/>
+                <w:szCs w:val="18"/>
+              </w:rPr>
+              <w:t xml:space="preserve">unsupported</w:t>
+            </w:r>
+          </w:p>
+        </w:tc>
+      </w:tr>
+      <w:tr>
+        <w:trPr>
+          <w:tblHeader w:val="off"/>
+        </w:trPr>
+        <w:tc>
+          <w:tcPr>
+            <w:tcW w:type="dxa" w:w="4255"/>
+            <w:tcBorders>
+              <w:top w:val="single" w:color="BFBFBF" w:sz="4"/>
+              <w:left w:val="single" w:color="BFBFBF" w:sz="4"/>
+              <w:bottom w:val="single" w:color="BFBFBF" w:sz="4"/>
+              <w:right w:val="single" w:color="BFBFBF" w:sz="4"/>
+            </w:tcBorders>
+            <w:tcMar>
+              <w:top w:type="dxa" w:w="40"/>
+              <w:left w:type="dxa" w:w="80"/>
+              <w:bottom w:type="dxa" w:w="40"/>
+              <w:right w:type="dxa" w:w="80"/>
+            </w:tcMar>
+          </w:tcPr>
+          <w:p>
+            <w:pPr>
+              <w:spacing w:after="0"/>
+            </w:pPr>
+            <w:r>
+              <w:rPr>
+                <w:sz w:val="18"/>
+                <w:szCs w:val="18"/>
+              </w:rPr>
+              <w:t xml:space="preserve">suggestion usefulness</w:t>
+            </w:r>
+          </w:p>
+        </w:tc>
+        <w:tc>
+          <w:tcPr>
+            <w:tcW w:type="dxa" w:w="1805"/>
+            <w:tcBorders>
+              <w:top w:val="single" w:color="BFBFBF" w:sz="4"/>
+              <w:left w:val="single" w:color="BFBFBF" w:sz="4"/>
+              <w:bottom w:val="single" w:color="BFBFBF" w:sz="4"/>
+              <w:right w:val="single" w:color="BFBFBF" w:sz="4"/>
+            </w:tcBorders>
+            <w:tcMar>
+              <w:top w:type="dxa" w:w="40"/>
+              <w:left w:type="dxa" w:w="80"/>
+              <w:bottom w:type="dxa" w:w="40"/>
+              <w:right w:type="dxa" w:w="80"/>
+            </w:tcMar>
+          </w:tcPr>
+          <w:p>
+            <w:pPr>
+              <w:spacing w:after="0"/>
+            </w:pPr>
+            <w:r>
+              <w:rPr>
+                <w:sz w:val="18"/>
+                <w:szCs w:val="18"/>
+              </w:rPr>
+              <w:t xml:space="preserve">n/a (no items)</w:t>
+            </w:r>
+          </w:p>
+        </w:tc>
+        <w:tc>
+          <w:tcPr>
+            <w:tcW w:type="dxa" w:w="2966"/>
+            <w:tcBorders>
+              <w:top w:val="single" w:color="BFBFBF" w:sz="4"/>
+              <w:left w:val="single" w:color="BFBFBF" w:sz="4"/>
+              <w:bottom w:val="single" w:color="BFBFBF" w:sz="4"/>
+              <w:right w:val="single" w:color="BFBFBF" w:sz="4"/>
+            </w:tcBorders>
+            <w:tcMar>
+              <w:top w:type="dxa" w:w="40"/>
+              <w:left w:type="dxa" w:w="80"/>
+              <w:bottom w:type="dxa" w:w="40"/>
+              <w:right w:type="dxa" w:w="80"/>
+            </w:tcMar>
+          </w:tcPr>
+          <w:p>
+            <w:pPr>
+              <w:spacing w:after="0"/>
+            </w:pPr>
+            <w:r>
+              <w:rPr>
+                <w:sz w:val="18"/>
+                <w:szCs w:val="18"/>
+              </w:rPr>
+              <w:t xml:space="preserve">rejected, meaning known</w:t>
+            </w:r>
+          </w:p>
+        </w:tc>
+      </w:tr>
+      <w:tr>
+        <w:trPr>
+          <w:tblHeader w:val="off"/>
+        </w:trPr>
+        <w:tc>
+          <w:tcPr>
+            <w:tcW w:type="dxa" w:w="4255"/>
+            <w:tcBorders>
+              <w:top w:val="single" w:color="BFBFBF" w:sz="4"/>
+              <w:left w:val="single" w:color="BFBFBF" w:sz="4"/>
+              <w:bottom w:val="single" w:color="BFBFBF" w:sz="4"/>
+              <w:right w:val="single" w:color="BFBFBF" w:sz="4"/>
+            </w:tcBorders>
+            <w:tcMar>
+              <w:top w:type="dxa" w:w="40"/>
+              <w:left w:type="dxa" w:w="80"/>
+              <w:bottom w:type="dxa" w:w="40"/>
+              <w:right w:type="dxa" w:w="80"/>
+            </w:tcMar>
+          </w:tcPr>
+          <w:p>
+            <w:pPr>
+              <w:spacing w:after="0"/>
+            </w:pPr>
+            <w:r>
+              <w:rPr>
+                <w:sz w:val="18"/>
+                <w:szCs w:val="18"/>
+              </w:rPr>
+              <w:t xml:space="preserve">wrong-code rate</w:t>
+            </w:r>
+          </w:p>
+        </w:tc>
+        <w:tc>
+          <w:tcPr>
+            <w:tcW w:type="dxa" w:w="1805"/>
+            <w:tcBorders>
+              <w:top w:val="single" w:color="BFBFBF" w:sz="4"/>
+              <w:left w:val="single" w:color="BFBFBF" w:sz="4"/>
+              <w:bottom w:val="single" w:color="BFBFBF" w:sz="4"/>
+              <w:right w:val="single" w:color="BFBFBF" w:sz="4"/>
+            </w:tcBorders>
+            <w:tcMar>
+              <w:top w:type="dxa" w:w="40"/>
+              <w:left w:type="dxa" w:w="80"/>
+              <w:bottom w:type="dxa" w:w="40"/>
+              <w:right w:type="dxa" w:w="80"/>
+            </w:tcMar>
+          </w:tcPr>
+          <w:p>
+            <w:pPr>
+              <w:spacing w:after="0"/>
+            </w:pPr>
+            <w:r>
+              <w:rPr>
+                <w:sz w:val="18"/>
+                <w:szCs w:val="18"/>
+              </w:rPr>
+              <w:t xml:space="preserve">0/25 (0.0%)</w:t>
+            </w:r>
+          </w:p>
+        </w:tc>
+        <w:tc>
+          <w:tcPr>
+            <w:tcW w:type="dxa" w:w="2966"/>
+            <w:tcBorders>
+              <w:top w:val="single" w:color="BFBFBF" w:sz="4"/>
+              <w:left w:val="single" w:color="BFBFBF" w:sz="4"/>
+              <w:bottom w:val="single" w:color="BFBFBF" w:sz="4"/>
+              <w:right w:val="single" w:color="BFBFBF" w:sz="4"/>
+            </w:tcBorders>
+            <w:tcMar>
+              <w:top w:type="dxa" w:w="40"/>
+              <w:left w:type="dxa" w:w="80"/>
+              <w:bottom w:type="dxa" w:w="40"/>
+              <w:right w:type="dxa" w:w="80"/>
+            </w:tcMar>
+          </w:tcPr>
+          <w:p>
+            <w:pPr>
+              <w:spacing w:after="0"/>
+            </w:pPr>
+            <w:r>
+              <w:rPr>
+                <w:sz w:val="18"/>
+                <w:szCs w:val="18"/>
+              </w:rPr>
+              <w:t xml:space="preserve">all</w:t>
+            </w:r>
+          </w:p>
+        </w:tc>
+      </w:tr>
+      <w:tr>
+        <w:trPr>
+          <w:tblHeader w:val="off"/>
+        </w:trPr>
+        <w:tc>
+          <w:tcPr>
+            <w:tcW w:type="dxa" w:w="4255"/>
+            <w:tcBorders>
+              <w:top w:val="single" w:color="BFBFBF" w:sz="4"/>
+              <w:left w:val="single" w:color="BFBFBF" w:sz="4"/>
+              <w:bottom w:val="single" w:color="BFBFBF" w:sz="4"/>
+              <w:right w:val="single" w:color="BFBFBF" w:sz="4"/>
+            </w:tcBorders>
+            <w:tcMar>
+              <w:top w:type="dxa" w:w="40"/>
+              <w:left w:type="dxa" w:w="80"/>
+              <w:bottom w:type="dxa" w:w="40"/>
+              <w:right w:type="dxa" w:w="80"/>
+            </w:tcMar>
+          </w:tcPr>
+          <w:p>
+            <w:pPr>
+              <w:spacing w:after="0"/>
+            </w:pPr>
+            <w:r>
+              <w:rPr>
+                <w:sz w:val="18"/>
+                <w:szCs w:val="18"/>
+              </w:rPr>
+              <w:t xml:space="preserve">crashes</w:t>
+            </w:r>
+          </w:p>
+        </w:tc>
+        <w:tc>
+          <w:tcPr>
+            <w:tcW w:type="dxa" w:w="1805"/>
+            <w:tcBorders>
+              <w:top w:val="single" w:color="BFBFBF" w:sz="4"/>
+              <w:left w:val="single" w:color="BFBFBF" w:sz="4"/>
+              <w:bottom w:val="single" w:color="BFBFBF" w:sz="4"/>
+              <w:right w:val="single" w:color="BFBFBF" w:sz="4"/>
+            </w:tcBorders>
+            <w:tcMar>
+              <w:top w:type="dxa" w:w="40"/>
+              <w:left w:type="dxa" w:w="80"/>
+              <w:bottom w:type="dxa" w:w="40"/>
+              <w:right w:type="dxa" w:w="80"/>
+            </w:tcMar>
+          </w:tcPr>
+          <w:p>
+            <w:pPr>
+              <w:spacing w:after="0"/>
+            </w:pPr>
+            <w:r>
+              <w:rPr>
+                <w:sz w:val="18"/>
+                <w:szCs w:val="18"/>
+              </w:rPr>
+              <w:t xml:space="preserve">0/25 (0.0%)</w:t>
+            </w:r>
+          </w:p>
+        </w:tc>
+        <w:tc>
+          <w:tcPr>
+            <w:tcW w:type="dxa" w:w="2966"/>
+            <w:tcBorders>
+              <w:top w:val="single" w:color="BFBFBF" w:sz="4"/>
+              <w:left w:val="single" w:color="BFBFBF" w:sz="4"/>
+              <w:bottom w:val="single" w:color="BFBFBF" w:sz="4"/>
+              <w:right w:val="single" w:color="BFBFBF" w:sz="4"/>
+            </w:tcBorders>
+            <w:tcMar>
+              <w:top w:type="dxa" w:w="40"/>
+              <w:left w:type="dxa" w:w="80"/>
+              <w:bottom w:type="dxa" w:w="40"/>
+              <w:right w:type="dxa" w:w="80"/>
+            </w:tcMar>
+          </w:tcPr>
+          <w:p>
+            <w:pPr>
+              <w:spacing w:after="0"/>
+            </w:pPr>
+            <w:r>
+              <w:rPr>
+                <w:sz w:val="18"/>
+                <w:szCs w:val="18"/>
+              </w:rPr>
+              <w:t xml:space="preserve">all</w:t>
+            </w:r>
+          </w:p>
+        </w:tc>
+      </w:tr>
+    </w:tbl>
+    <w:p>
+      <w:pPr>
+        <w:spacing w:after="60"/>
+      </w:pPr>
+    </w:p>
+    <w:tbl>
+      <w:tblPr>
+        <w:tblW w:type="dxa" w:w="9026"/>
+        <w:tblBorders>
+          <w:top w:val="single" w:color="auto" w:sz="4"/>
+          <w:left w:val="single" w:color="auto" w:sz="4"/>
+          <w:bottom w:val="single" w:color="auto" w:sz="4"/>
+          <w:right w:val="single" w:color="auto" w:sz="4"/>
+          <w:insideH w:val="single" w:color="auto" w:sz="4"/>
+          <w:insideV w:val="single" w:color="auto" w:sz="4"/>
+        </w:tblBorders>
+        <w:tblLayout w:type="fixed"/>
+      </w:tblPr>
+      <w:tblGrid>
+        <w:gridCol w:w="1216"/>
+        <w:gridCol w:w="1419"/>
+        <w:gridCol w:w="1216"/>
+        <w:gridCol w:w="1318"/>
+        <w:gridCol w:w="1216"/>
+        <w:gridCol w:w="1419"/>
+        <w:gridCol w:w="1222"/>
+      </w:tblGrid>
+      <w:tr>
+        <w:trPr>
+          <w:tblHeader/>
+        </w:trPr>
+        <w:tc>
+          <w:tcPr>
+            <w:tcW w:type="dxa" w:w="1216"/>
+            <w:tcBorders>
+              <w:top w:val="single" w:color="BFBFBF" w:sz="4"/>
+              <w:left w:val="single" w:color="BFBFBF" w:sz="4"/>
+              <w:bottom w:val="single" w:color="BFBFBF" w:sz="4"/>
+              <w:right w:val="single" w:color="BFBFBF" w:sz="4"/>
+            </w:tcBorders>
+            <w:shd w:fill="E8EEF7" w:color="auto" w:val="clear"/>
+            <w:tcMar>
+              <w:top w:type="dxa" w:w="40"/>
+              <w:left w:type="dxa" w:w="80"/>
+              <w:bottom w:type="dxa" w:w="40"/>
+              <w:right w:type="dxa" w:w="80"/>
+            </w:tcMar>
+          </w:tcPr>
+          <w:p>
+            <w:pPr>
+              <w:spacing w:after="0"/>
+            </w:pPr>
+            <w:r>
+              <w:rPr>
+                <w:b/>
+                <w:bCs/>
+                <w:sz w:val="16"/>
+                <w:szCs w:val="16"/>
+              </w:rPr>
+              <w:t xml:space="preserve">Condition</w:t>
+            </w:r>
+          </w:p>
+        </w:tc>
+        <w:tc>
+          <w:tcPr>
+            <w:tcW w:type="dxa" w:w="1419"/>
+            <w:tcBorders>
+              <w:top w:val="single" w:color="BFBFBF" w:sz="4"/>
+              <w:left w:val="single" w:color="BFBFBF" w:sz="4"/>
+              <w:bottom w:val="single" w:color="BFBFBF" w:sz="4"/>
+              <w:right w:val="single" w:color="BFBFBF" w:sz="4"/>
+            </w:tcBorders>
+            <w:shd w:fill="E8EEF7" w:color="auto" w:val="clear"/>
+            <w:tcMar>
+              <w:top w:type="dxa" w:w="40"/>
+              <w:left w:type="dxa" w:w="80"/>
+              <w:bottom w:type="dxa" w:w="40"/>
+              <w:right w:type="dxa" w:w="80"/>
+            </w:tcMar>
+          </w:tcPr>
+          <w:p>
+            <w:pPr>
+              <w:spacing w:after="0"/>
+            </w:pPr>
+            <w:r>
+              <w:rPr>
+                <w:b/>
+                <w:bCs/>
+                <w:sz w:val="16"/>
+                <w:szCs w:val="16"/>
+              </w:rPr>
+              <w:t xml:space="preserve">exact-match accuracy</w:t>
+            </w:r>
+          </w:p>
+        </w:tc>
+        <w:tc>
+          <w:tcPr>
+            <w:tcW w:type="dxa" w:w="1216"/>
+            <w:tcBorders>
+              <w:top w:val="single" w:color="BFBFBF" w:sz="4"/>
+              <w:left w:val="single" w:color="BFBFBF" w:sz="4"/>
+              <w:bottom w:val="single" w:color="BFBFBF" w:sz="4"/>
+              <w:right w:val="single" w:color="BFBFBF" w:sz="4"/>
+            </w:tcBorders>
+            <w:shd w:fill="E8EEF7" w:color="auto" w:val="clear"/>
+            <w:tcMar>
+              <w:top w:type="dxa" w:w="40"/>
+              <w:left w:type="dxa" w:w="80"/>
+              <w:bottom w:type="dxa" w:w="40"/>
+              <w:right w:type="dxa" w:w="80"/>
+            </w:tcMar>
+          </w:tcPr>
+          <w:p>
+            <w:pPr>
+              <w:spacing w:after="0"/>
+            </w:pPr>
+            <w:r>
+              <w:rPr>
+                <w:b/>
+                <w:bCs/>
+                <w:sz w:val="16"/>
+                <w:szCs w:val="16"/>
+              </w:rPr>
+              <w:t xml:space="preserve">wrong-code rate</w:t>
+            </w:r>
+          </w:p>
+        </w:tc>
+        <w:tc>
+          <w:tcPr>
+            <w:tcW w:type="dxa" w:w="1318"/>
+            <w:tcBorders>
+              <w:top w:val="single" w:color="BFBFBF" w:sz="4"/>
+              <w:left w:val="single" w:color="BFBFBF" w:sz="4"/>
+              <w:bottom w:val="single" w:color="BFBFBF" w:sz="4"/>
+              <w:right w:val="single" w:color="BFBFBF" w:sz="4"/>
+            </w:tcBorders>
+            <w:shd w:fill="E8EEF7" w:color="auto" w:val="clear"/>
+            <w:tcMar>
+              <w:top w:type="dxa" w:w="40"/>
+              <w:left w:type="dxa" w:w="80"/>
+              <w:bottom w:type="dxa" w:w="40"/>
+              <w:right w:type="dxa" w:w="80"/>
+            </w:tcMar>
+          </w:tcPr>
+          <w:p>
+            <w:pPr>
+              <w:spacing w:after="0"/>
+            </w:pPr>
+            <w:r>
+              <w:rPr>
+                <w:b/>
+                <w:bCs/>
+                <w:sz w:val="16"/>
+                <w:szCs w:val="16"/>
+              </w:rPr>
+              <w:t xml:space="preserve">unnecessary-question rate</w:t>
+            </w:r>
+          </w:p>
+        </w:tc>
+        <w:tc>
+          <w:tcPr>
+            <w:tcW w:type="dxa" w:w="1216"/>
+            <w:tcBorders>
+              <w:top w:val="single" w:color="BFBFBF" w:sz="4"/>
+              <w:left w:val="single" w:color="BFBFBF" w:sz="4"/>
+              <w:bottom w:val="single" w:color="BFBFBF" w:sz="4"/>
+              <w:right w:val="single" w:color="BFBFBF" w:sz="4"/>
+            </w:tcBorders>
+            <w:shd w:fill="E8EEF7" w:color="auto" w:val="clear"/>
+            <w:tcMar>
+              <w:top w:type="dxa" w:w="40"/>
+              <w:left w:type="dxa" w:w="80"/>
+              <w:bottom w:type="dxa" w:w="40"/>
+              <w:right w:type="dxa" w:w="80"/>
+            </w:tcMar>
+          </w:tcPr>
+          <w:p>
+            <w:pPr>
+              <w:spacing w:after="0"/>
+            </w:pPr>
+            <w:r>
+              <w:rPr>
+                <w:b/>
+                <w:bCs/>
+                <w:sz w:val="16"/>
+                <w:szCs w:val="16"/>
+              </w:rPr>
+              <w:t xml:space="preserve">ambiguity recall</w:t>
+            </w:r>
+          </w:p>
+        </w:tc>
+        <w:tc>
+          <w:tcPr>
+            <w:tcW w:type="dxa" w:w="1419"/>
+            <w:tcBorders>
+              <w:top w:val="single" w:color="BFBFBF" w:sz="4"/>
+              <w:left w:val="single" w:color="BFBFBF" w:sz="4"/>
+              <w:bottom w:val="single" w:color="BFBFBF" w:sz="4"/>
+              <w:right w:val="single" w:color="BFBFBF" w:sz="4"/>
+            </w:tcBorders>
+            <w:shd w:fill="E8EEF7" w:color="auto" w:val="clear"/>
+            <w:tcMar>
+              <w:top w:type="dxa" w:w="40"/>
+              <w:left w:type="dxa" w:w="80"/>
+              <w:bottom w:type="dxa" w:w="40"/>
+              <w:right w:type="dxa" w:w="80"/>
+            </w:tcMar>
+          </w:tcPr>
+          <w:p>
+            <w:pPr>
+              <w:spacing w:after="0"/>
+            </w:pPr>
+            <w:r>
+              <w:rPr>
+                <w:b/>
+                <w:bCs/>
+                <w:sz w:val="16"/>
+                <w:szCs w:val="16"/>
+              </w:rPr>
+              <w:t xml:space="preserve">context-resolution accuracy</w:t>
+            </w:r>
+          </w:p>
+        </w:tc>
+        <w:tc>
+          <w:tcPr>
+            <w:tcW w:type="dxa" w:w="1222"/>
+            <w:tcBorders>
+              <w:top w:val="single" w:color="BFBFBF" w:sz="4"/>
+              <w:left w:val="single" w:color="BFBFBF" w:sz="4"/>
+              <w:bottom w:val="single" w:color="BFBFBF" w:sz="4"/>
+              <w:right w:val="single" w:color="BFBFBF" w:sz="4"/>
+            </w:tcBorders>
+            <w:shd w:fill="E8EEF7" w:color="auto" w:val="clear"/>
+            <w:tcMar>
+              <w:top w:type="dxa" w:w="40"/>
+              <w:left w:type="dxa" w:w="80"/>
+              <w:bottom w:type="dxa" w:w="40"/>
+              <w:right w:type="dxa" w:w="80"/>
+            </w:tcMar>
+          </w:tcPr>
+          <w:p>
+            <w:pPr>
+              <w:spacing w:after="0"/>
+            </w:pPr>
+            <w:r>
+              <w:rPr>
+                <w:b/>
+                <w:bCs/>
+                <w:sz w:val="16"/>
+                <w:szCs w:val="16"/>
+              </w:rPr>
+              <w:t xml:space="preserve">safe-rejection rate</w:t>
+            </w:r>
+          </w:p>
+        </w:tc>
+      </w:tr>
+      <w:tr>
+        <w:trPr>
+          <w:tblHeader w:val="off"/>
+        </w:trPr>
+        <w:tc>
+          <w:tcPr>
+            <w:tcW w:type="dxa" w:w="1216"/>
+            <w:tcBorders>
+              <w:top w:val="single" w:color="BFBFBF" w:sz="4"/>
+              <w:left w:val="single" w:color="BFBFBF" w:sz="4"/>
+              <w:bottom w:val="single" w:color="BFBFBF" w:sz="4"/>
+              <w:right w:val="single" w:color="BFBFBF" w:sz="4"/>
+            </w:tcBorders>
+            <w:tcMar>
+              <w:top w:type="dxa" w:w="40"/>
+              <w:left w:type="dxa" w:w="80"/>
+              <w:bottom w:type="dxa" w:w="40"/>
+              <w:right w:type="dxa" w:w="80"/>
+            </w:tcMar>
+          </w:tcPr>
+          <w:p>
+            <w:pPr>
+              <w:spacing w:after="0"/>
+            </w:pPr>
+            <w:r>
+              <w:rPr>
+                <w:sz w:val="16"/>
+                <w:szCs w:val="16"/>
+              </w:rPr>
+              <w:t xml:space="preserve">baseline</w:t>
+            </w:r>
+          </w:p>
+        </w:tc>
+        <w:tc>
+          <w:tcPr>
+            <w:tcW w:type="dxa" w:w="1419"/>
+            <w:tcBorders>
+              <w:top w:val="single" w:color="BFBFBF" w:sz="4"/>
+              <w:left w:val="single" w:color="BFBFBF" w:sz="4"/>
+              <w:bottom w:val="single" w:color="BFBFBF" w:sz="4"/>
+              <w:right w:val="single" w:color="BFBFBF" w:sz="4"/>
+            </w:tcBorders>
+            <w:tcMar>
+              <w:top w:type="dxa" w:w="40"/>
+              <w:left w:type="dxa" w:w="80"/>
+              <w:bottom w:type="dxa" w:w="40"/>
+              <w:right w:type="dxa" w:w="80"/>
+            </w:tcMar>
+          </w:tcPr>
+          <w:p>
+            <w:pPr>
+              <w:spacing w:after="0"/>
+            </w:pPr>
+            <w:r>
+              <w:rPr>
+                <w:sz w:val="16"/>
+                <w:szCs w:val="16"/>
+              </w:rPr>
+              <w:t xml:space="preserve">19/19 (100.0%)</w:t>
+            </w:r>
+          </w:p>
+        </w:tc>
+        <w:tc>
+          <w:tcPr>
+            <w:tcW w:type="dxa" w:w="1216"/>
+            <w:tcBorders>
+              <w:top w:val="single" w:color="BFBFBF" w:sz="4"/>
+              <w:left w:val="single" w:color="BFBFBF" w:sz="4"/>
+              <w:bottom w:val="single" w:color="BFBFBF" w:sz="4"/>
+              <w:right w:val="single" w:color="BFBFBF" w:sz="4"/>
+            </w:tcBorders>
+            <w:tcMar>
+              <w:top w:type="dxa" w:w="40"/>
+              <w:left w:type="dxa" w:w="80"/>
+              <w:bottom w:type="dxa" w:w="40"/>
+              <w:right w:type="dxa" w:w="80"/>
+            </w:tcMar>
+          </w:tcPr>
+          <w:p>
+            <w:pPr>
+              <w:spacing w:after="0"/>
+            </w:pPr>
+            <w:r>
+              <w:rPr>
+                <w:sz w:val="16"/>
+                <w:szCs w:val="16"/>
+              </w:rPr>
+              <w:t xml:space="preserve">0/25 (0.0%)</w:t>
+            </w:r>
+          </w:p>
+        </w:tc>
+        <w:tc>
+          <w:tcPr>
+            <w:tcW w:type="dxa" w:w="1318"/>
+            <w:tcBorders>
+              <w:top w:val="single" w:color="BFBFBF" w:sz="4"/>
+              <w:left w:val="single" w:color="BFBFBF" w:sz="4"/>
+              <w:bottom w:val="single" w:color="BFBFBF" w:sz="4"/>
+              <w:right w:val="single" w:color="BFBFBF" w:sz="4"/>
+            </w:tcBorders>
+            <w:tcMar>
+              <w:top w:type="dxa" w:w="40"/>
+              <w:left w:type="dxa" w:w="80"/>
+              <w:bottom w:type="dxa" w:w="40"/>
+              <w:right w:type="dxa" w:w="80"/>
+            </w:tcMar>
+          </w:tcPr>
+          <w:p>
+            <w:pPr>
+              <w:spacing w:after="0"/>
+            </w:pPr>
+            <w:r>
+              <w:rPr>
+                <w:sz w:val="16"/>
+                <w:szCs w:val="16"/>
+              </w:rPr>
+              <w:t xml:space="preserve">0/19 (0.0%)</w:t>
+            </w:r>
+          </w:p>
+        </w:tc>
+        <w:tc>
+          <w:tcPr>
+            <w:tcW w:type="dxa" w:w="1216"/>
+            <w:tcBorders>
+              <w:top w:val="single" w:color="BFBFBF" w:sz="4"/>
+              <w:left w:val="single" w:color="BFBFBF" w:sz="4"/>
+              <w:bottom w:val="single" w:color="BFBFBF" w:sz="4"/>
+              <w:right w:val="single" w:color="BFBFBF" w:sz="4"/>
+            </w:tcBorders>
+            <w:tcMar>
+              <w:top w:type="dxa" w:w="40"/>
+              <w:left w:type="dxa" w:w="80"/>
+              <w:bottom w:type="dxa" w:w="40"/>
+              <w:right w:type="dxa" w:w="80"/>
+            </w:tcMar>
+          </w:tcPr>
+          <w:p>
+            <w:pPr>
+              <w:spacing w:after="0"/>
+            </w:pPr>
+            <w:r>
+              <w:rPr>
+                <w:sz w:val="16"/>
+                <w:szCs w:val="16"/>
+              </w:rPr>
+              <w:t xml:space="preserve">3/3 (100.0%)</w:t>
+            </w:r>
+          </w:p>
+        </w:tc>
+        <w:tc>
+          <w:tcPr>
+            <w:tcW w:type="dxa" w:w="1419"/>
+            <w:tcBorders>
+              <w:top w:val="single" w:color="BFBFBF" w:sz="4"/>
+              <w:left w:val="single" w:color="BFBFBF" w:sz="4"/>
+              <w:bottom w:val="single" w:color="BFBFBF" w:sz="4"/>
+              <w:right w:val="single" w:color="BFBFBF" w:sz="4"/>
+            </w:tcBorders>
+            <w:tcMar>
+              <w:top w:type="dxa" w:w="40"/>
+              <w:left w:type="dxa" w:w="80"/>
+              <w:bottom w:type="dxa" w:w="40"/>
+              <w:right w:type="dxa" w:w="80"/>
+            </w:tcMar>
+          </w:tcPr>
+          <w:p>
+            <w:pPr>
+              <w:spacing w:after="0"/>
+            </w:pPr>
+            <w:r>
+              <w:rPr>
+                <w:sz w:val="16"/>
+                <w:szCs w:val="16"/>
+              </w:rPr>
+              <w:t xml:space="preserve">15/15 (100.0%)</w:t>
+            </w:r>
+          </w:p>
+        </w:tc>
+        <w:tc>
+          <w:tcPr>
+            <w:tcW w:type="dxa" w:w="1222"/>
+            <w:tcBorders>
+              <w:top w:val="single" w:color="BFBFBF" w:sz="4"/>
+              <w:left w:val="single" w:color="BFBFBF" w:sz="4"/>
+              <w:bottom w:val="single" w:color="BFBFBF" w:sz="4"/>
+              <w:right w:val="single" w:color="BFBFBF" w:sz="4"/>
+            </w:tcBorders>
+            <w:tcMar>
+              <w:top w:type="dxa" w:w="40"/>
+              <w:left w:type="dxa" w:w="80"/>
+              <w:bottom w:type="dxa" w:w="40"/>
+              <w:right w:type="dxa" w:w="80"/>
+            </w:tcMar>
+          </w:tcPr>
+          <w:p>
+            <w:pPr>
+              <w:spacing w:after="0"/>
+            </w:pPr>
+            <w:r>
+              <w:rPr>
+                <w:sz w:val="16"/>
+                <w:szCs w:val="16"/>
+              </w:rPr>
+              <w:t xml:space="preserve">3/3 (100.0%)</w:t>
+            </w:r>
+          </w:p>
+        </w:tc>
+      </w:tr>
+      <w:tr>
+        <w:trPr>
+          <w:tblHeader w:val="off"/>
+        </w:trPr>
+        <w:tc>
+          <w:tcPr>
+            <w:tcW w:type="dxa" w:w="1216"/>
+            <w:tcBorders>
+              <w:top w:val="single" w:color="BFBFBF" w:sz="4"/>
+              <w:left w:val="single" w:color="BFBFBF" w:sz="4"/>
+              <w:bottom w:val="single" w:color="BFBFBF" w:sz="4"/>
+              <w:right w:val="single" w:color="BFBFBF" w:sz="4"/>
+            </w:tcBorders>
+            <w:tcMar>
+              <w:top w:type="dxa" w:w="40"/>
+              <w:left w:type="dxa" w:w="80"/>
+              <w:bottom w:type="dxa" w:w="40"/>
+              <w:right w:type="dxa" w:w="80"/>
+            </w:tcMar>
+          </w:tcPr>
+          <w:p>
+            <w:pPr>
+              <w:spacing w:after="0"/>
+            </w:pPr>
+            <w:r>
+              <w:rPr>
+                <w:sz w:val="16"/>
+                <w:szCs w:val="16"/>
+              </w:rPr>
+              <w:t xml:space="preserve">context_off</w:t>
+            </w:r>
+          </w:p>
+        </w:tc>
+        <w:tc>
+          <w:tcPr>
+            <w:tcW w:type="dxa" w:w="1419"/>
+            <w:tcBorders>
+              <w:top w:val="single" w:color="BFBFBF" w:sz="4"/>
+              <w:left w:val="single" w:color="BFBFBF" w:sz="4"/>
+              <w:bottom w:val="single" w:color="BFBFBF" w:sz="4"/>
+              <w:right w:val="single" w:color="BFBFBF" w:sz="4"/>
+            </w:tcBorders>
+            <w:tcMar>
+              <w:top w:type="dxa" w:w="40"/>
+              <w:left w:type="dxa" w:w="80"/>
+              <w:bottom w:type="dxa" w:w="40"/>
+              <w:right w:type="dxa" w:w="80"/>
+            </w:tcMar>
+          </w:tcPr>
+          <w:p>
+            <w:pPr>
+              <w:spacing w:after="0"/>
+            </w:pPr>
+            <w:r>
+              <w:rPr>
+                <w:sz w:val="16"/>
+                <w:szCs w:val="16"/>
+              </w:rPr>
+              <w:t xml:space="preserve">11/19 (57.9%)</w:t>
+            </w:r>
+          </w:p>
+        </w:tc>
+        <w:tc>
+          <w:tcPr>
+            <w:tcW w:type="dxa" w:w="1216"/>
+            <w:tcBorders>
+              <w:top w:val="single" w:color="BFBFBF" w:sz="4"/>
+              <w:left w:val="single" w:color="BFBFBF" w:sz="4"/>
+              <w:bottom w:val="single" w:color="BFBFBF" w:sz="4"/>
+              <w:right w:val="single" w:color="BFBFBF" w:sz="4"/>
+            </w:tcBorders>
+            <w:tcMar>
+              <w:top w:type="dxa" w:w="40"/>
+              <w:left w:type="dxa" w:w="80"/>
+              <w:bottom w:type="dxa" w:w="40"/>
+              <w:right w:type="dxa" w:w="80"/>
+            </w:tcMar>
+          </w:tcPr>
+          <w:p>
+            <w:pPr>
+              <w:spacing w:after="0"/>
+            </w:pPr>
+            <w:r>
+              <w:rPr>
+                <w:sz w:val="16"/>
+                <w:szCs w:val="16"/>
+              </w:rPr>
+              <w:t xml:space="preserve">0/25 (0.0%)</w:t>
+            </w:r>
+          </w:p>
+        </w:tc>
+        <w:tc>
+          <w:tcPr>
+            <w:tcW w:type="dxa" w:w="1318"/>
+            <w:tcBorders>
+              <w:top w:val="single" w:color="BFBFBF" w:sz="4"/>
+              <w:left w:val="single" w:color="BFBFBF" w:sz="4"/>
+              <w:bottom w:val="single" w:color="BFBFBF" w:sz="4"/>
+              <w:right w:val="single" w:color="BFBFBF" w:sz="4"/>
+            </w:tcBorders>
+            <w:tcMar>
+              <w:top w:type="dxa" w:w="40"/>
+              <w:left w:type="dxa" w:w="80"/>
+              <w:bottom w:type="dxa" w:w="40"/>
+              <w:right w:type="dxa" w:w="80"/>
+            </w:tcMar>
+          </w:tcPr>
+          <w:p>
+            <w:pPr>
+              <w:spacing w:after="0"/>
+            </w:pPr>
+            <w:r>
+              <w:rPr>
+                <w:sz w:val="16"/>
+                <w:szCs w:val="16"/>
+              </w:rPr>
+              <w:t xml:space="preserve">0/19 (0.0%)</w:t>
+            </w:r>
+          </w:p>
+        </w:tc>
+        <w:tc>
+          <w:tcPr>
+            <w:tcW w:type="dxa" w:w="1216"/>
+            <w:tcBorders>
+              <w:top w:val="single" w:color="BFBFBF" w:sz="4"/>
+              <w:left w:val="single" w:color="BFBFBF" w:sz="4"/>
+              <w:bottom w:val="single" w:color="BFBFBF" w:sz="4"/>
+              <w:right w:val="single" w:color="BFBFBF" w:sz="4"/>
+            </w:tcBorders>
+            <w:tcMar>
+              <w:top w:type="dxa" w:w="40"/>
+              <w:left w:type="dxa" w:w="80"/>
+              <w:bottom w:type="dxa" w:w="40"/>
+              <w:right w:type="dxa" w:w="80"/>
+            </w:tcMar>
+          </w:tcPr>
+          <w:p>
+            <w:pPr>
+              <w:spacing w:after="0"/>
+            </w:pPr>
+            <w:r>
+              <w:rPr>
+                <w:sz w:val="16"/>
+                <w:szCs w:val="16"/>
+              </w:rPr>
+              <w:t xml:space="preserve">2/3 (66.7%)</w:t>
+            </w:r>
+          </w:p>
+        </w:tc>
+        <w:tc>
+          <w:tcPr>
+            <w:tcW w:type="dxa" w:w="1419"/>
+            <w:tcBorders>
+              <w:top w:val="single" w:color="BFBFBF" w:sz="4"/>
+              <w:left w:val="single" w:color="BFBFBF" w:sz="4"/>
+              <w:bottom w:val="single" w:color="BFBFBF" w:sz="4"/>
+              <w:right w:val="single" w:color="BFBFBF" w:sz="4"/>
+            </w:tcBorders>
+            <w:tcMar>
+              <w:top w:type="dxa" w:w="40"/>
+              <w:left w:type="dxa" w:w="80"/>
+              <w:bottom w:type="dxa" w:w="40"/>
+              <w:right w:type="dxa" w:w="80"/>
+            </w:tcMar>
+          </w:tcPr>
+          <w:p>
+            <w:pPr>
+              <w:spacing w:after="0"/>
+            </w:pPr>
+            <w:r>
+              <w:rPr>
+                <w:sz w:val="16"/>
+                <w:szCs w:val="16"/>
+              </w:rPr>
+              <w:t xml:space="preserve">7/15 (46.7%)</w:t>
+            </w:r>
+          </w:p>
+        </w:tc>
+        <w:tc>
+          <w:tcPr>
+            <w:tcW w:type="dxa" w:w="1222"/>
+            <w:tcBorders>
+              <w:top w:val="single" w:color="BFBFBF" w:sz="4"/>
+              <w:left w:val="single" w:color="BFBFBF" w:sz="4"/>
+              <w:bottom w:val="single" w:color="BFBFBF" w:sz="4"/>
+              <w:right w:val="single" w:color="BFBFBF" w:sz="4"/>
+            </w:tcBorders>
+            <w:tcMar>
+              <w:top w:type="dxa" w:w="40"/>
+              <w:left w:type="dxa" w:w="80"/>
+              <w:bottom w:type="dxa" w:w="40"/>
+              <w:right w:type="dxa" w:w="80"/>
+            </w:tcMar>
+          </w:tcPr>
+          <w:p>
+            <w:pPr>
+              <w:spacing w:after="0"/>
+            </w:pPr>
+            <w:r>
+              <w:rPr>
+                <w:sz w:val="16"/>
+                <w:szCs w:val="16"/>
+              </w:rPr>
+              <w:t xml:space="preserve">3/3 (100.0%)</w:t>
+            </w:r>
+          </w:p>
+        </w:tc>
+      </w:tr>
+      <w:tr>
+        <w:trPr>
+          <w:tblHeader w:val="off"/>
+        </w:trPr>
+        <w:tc>
+          <w:tcPr>
+            <w:tcW w:type="dxa" w:w="1216"/>
+            <w:tcBorders>
+              <w:top w:val="single" w:color="BFBFBF" w:sz="4"/>
+              <w:left w:val="single" w:color="BFBFBF" w:sz="4"/>
+              <w:bottom w:val="single" w:color="BFBFBF" w:sz="4"/>
+              <w:right w:val="single" w:color="BFBFBF" w:sz="4"/>
+            </w:tcBorders>
+            <w:tcMar>
+              <w:top w:type="dxa" w:w="40"/>
+              <w:left w:type="dxa" w:w="80"/>
+              <w:bottom w:type="dxa" w:w="40"/>
+              <w:right w:type="dxa" w:w="80"/>
+            </w:tcMar>
+          </w:tcPr>
+          <w:p>
+            <w:pPr>
+              <w:spacing w:after="0"/>
+            </w:pPr>
+            <w:r>
+              <w:rPr>
+                <w:sz w:val="16"/>
+                <w:szCs w:val="16"/>
+              </w:rPr>
+              <w:t xml:space="preserve">forced_top1</w:t>
+            </w:r>
+          </w:p>
+        </w:tc>
+        <w:tc>
+          <w:tcPr>
+            <w:tcW w:type="dxa" w:w="1419"/>
+            <w:tcBorders>
+              <w:top w:val="single" w:color="BFBFBF" w:sz="4"/>
+              <w:left w:val="single" w:color="BFBFBF" w:sz="4"/>
+              <w:bottom w:val="single" w:color="BFBFBF" w:sz="4"/>
+              <w:right w:val="single" w:color="BFBFBF" w:sz="4"/>
+            </w:tcBorders>
+            <w:tcMar>
+              <w:top w:type="dxa" w:w="40"/>
+              <w:left w:type="dxa" w:w="80"/>
+              <w:bottom w:type="dxa" w:w="40"/>
+              <w:right w:type="dxa" w:w="80"/>
+            </w:tcMar>
+          </w:tcPr>
+          <w:p>
+            <w:pPr>
+              <w:spacing w:after="0"/>
+            </w:pPr>
+            <w:r>
+              <w:rPr>
+                <w:sz w:val="16"/>
+                <w:szCs w:val="16"/>
+              </w:rPr>
+              <w:t xml:space="preserve">19/19 (100.0%)</w:t>
+            </w:r>
+          </w:p>
+        </w:tc>
+        <w:tc>
+          <w:tcPr>
+            <w:tcW w:type="dxa" w:w="1216"/>
+            <w:tcBorders>
+              <w:top w:val="single" w:color="BFBFBF" w:sz="4"/>
+              <w:left w:val="single" w:color="BFBFBF" w:sz="4"/>
+              <w:bottom w:val="single" w:color="BFBFBF" w:sz="4"/>
+              <w:right w:val="single" w:color="BFBFBF" w:sz="4"/>
+            </w:tcBorders>
+            <w:tcMar>
+              <w:top w:type="dxa" w:w="40"/>
+              <w:left w:type="dxa" w:w="80"/>
+              <w:bottom w:type="dxa" w:w="40"/>
+              <w:right w:type="dxa" w:w="80"/>
+            </w:tcMar>
+          </w:tcPr>
+          <w:p>
+            <w:pPr>
+              <w:spacing w:after="0"/>
+            </w:pPr>
+            <w:r>
+              <w:rPr>
+                <w:sz w:val="16"/>
+                <w:szCs w:val="16"/>
+              </w:rPr>
+              <w:t xml:space="preserve">2/25 (8.0%)</w:t>
+            </w:r>
+          </w:p>
+        </w:tc>
+        <w:tc>
+          <w:tcPr>
+            <w:tcW w:type="dxa" w:w="1318"/>
+            <w:tcBorders>
+              <w:top w:val="single" w:color="BFBFBF" w:sz="4"/>
+              <w:left w:val="single" w:color="BFBFBF" w:sz="4"/>
+              <w:bottom w:val="single" w:color="BFBFBF" w:sz="4"/>
+              <w:right w:val="single" w:color="BFBFBF" w:sz="4"/>
+            </w:tcBorders>
+            <w:tcMar>
+              <w:top w:type="dxa" w:w="40"/>
+              <w:left w:type="dxa" w:w="80"/>
+              <w:bottom w:type="dxa" w:w="40"/>
+              <w:right w:type="dxa" w:w="80"/>
+            </w:tcMar>
+          </w:tcPr>
+          <w:p>
+            <w:pPr>
+              <w:spacing w:after="0"/>
+            </w:pPr>
+            <w:r>
+              <w:rPr>
+                <w:sz w:val="16"/>
+                <w:szCs w:val="16"/>
+              </w:rPr>
+              <w:t xml:space="preserve">0/19 (0.0%)</w:t>
+            </w:r>
+          </w:p>
+        </w:tc>
+        <w:tc>
+          <w:tcPr>
+            <w:tcW w:type="dxa" w:w="1216"/>
+            <w:tcBorders>
+              <w:top w:val="single" w:color="BFBFBF" w:sz="4"/>
+              <w:left w:val="single" w:color="BFBFBF" w:sz="4"/>
+              <w:bottom w:val="single" w:color="BFBFBF" w:sz="4"/>
+              <w:right w:val="single" w:color="BFBFBF" w:sz="4"/>
+            </w:tcBorders>
+            <w:tcMar>
+              <w:top w:type="dxa" w:w="40"/>
+              <w:left w:type="dxa" w:w="80"/>
+              <w:bottom w:type="dxa" w:w="40"/>
+              <w:right w:type="dxa" w:w="80"/>
+            </w:tcMar>
+          </w:tcPr>
+          <w:p>
+            <w:pPr>
+              <w:spacing w:after="0"/>
+            </w:pPr>
+            <w:r>
+              <w:rPr>
+                <w:sz w:val="16"/>
+                <w:szCs w:val="16"/>
+              </w:rPr>
+              <w:t xml:space="preserve">1/3 (33.3%)</w:t>
+            </w:r>
+          </w:p>
+        </w:tc>
+        <w:tc>
+          <w:tcPr>
+            <w:tcW w:type="dxa" w:w="1419"/>
+            <w:tcBorders>
+              <w:top w:val="single" w:color="BFBFBF" w:sz="4"/>
+              <w:left w:val="single" w:color="BFBFBF" w:sz="4"/>
+              <w:bottom w:val="single" w:color="BFBFBF" w:sz="4"/>
+              <w:right w:val="single" w:color="BFBFBF" w:sz="4"/>
+            </w:tcBorders>
+            <w:tcMar>
+              <w:top w:type="dxa" w:w="40"/>
+              <w:left w:type="dxa" w:w="80"/>
+              <w:bottom w:type="dxa" w:w="40"/>
+              <w:right w:type="dxa" w:w="80"/>
+            </w:tcMar>
+          </w:tcPr>
+          <w:p>
+            <w:pPr>
+              <w:spacing w:after="0"/>
+            </w:pPr>
+            <w:r>
+              <w:rPr>
+                <w:sz w:val="16"/>
+                <w:szCs w:val="16"/>
+              </w:rPr>
+              <w:t xml:space="preserve">15/15 (100.0%)</w:t>
+            </w:r>
+          </w:p>
+        </w:tc>
+        <w:tc>
+          <w:tcPr>
+            <w:tcW w:type="dxa" w:w="1222"/>
+            <w:tcBorders>
+              <w:top w:val="single" w:color="BFBFBF" w:sz="4"/>
+              <w:left w:val="single" w:color="BFBFBF" w:sz="4"/>
+              <w:bottom w:val="single" w:color="BFBFBF" w:sz="4"/>
+              <w:right w:val="single" w:color="BFBFBF" w:sz="4"/>
+            </w:tcBorders>
+            <w:tcMar>
+              <w:top w:type="dxa" w:w="40"/>
+              <w:left w:type="dxa" w:w="80"/>
+              <w:bottom w:type="dxa" w:w="40"/>
+              <w:right w:type="dxa" w:w="80"/>
+            </w:tcMar>
+          </w:tcPr>
+          <w:p>
+            <w:pPr>
+              <w:spacing w:after="0"/>
+            </w:pPr>
+            <w:r>
+              <w:rPr>
+                <w:sz w:val="16"/>
+                <w:szCs w:val="16"/>
+              </w:rPr>
+              <w:t xml:space="preserve">3/3 (100.0%)</w:t>
+            </w:r>
+          </w:p>
+        </w:tc>
+      </w:tr>
+    </w:tbl>
+    <w:p>
+      <w:pPr>
+        <w:spacing w:after="60"/>
+      </w:pPr>
     </w:p>
     <w:p>
       <w:pPr>
@@ -9300,14 +11382,7 @@
         <w:spacing w:after="60"/>
       </w:pPr>
       <w:r>
-        <w:rPr>
-          <w:b/>
-          <w:bCs/>
-        </w:rPr>
-        <w:t xml:space="preserve">Paraphrase consistency is 1/15 groups</w:t>
-      </w:r>
-      <w:r>
-        <w:t xml:space="preserve">, both for "all members give the same AST" and for "all members give the gold AST". In 13 groups the out-of-coverage phrasing is rejected, and one paraphrase ends in a semantic error. Per input, 46 of 60 paraphrases (76.7%) match.</w:t>
+        <w:t xml:space="preserve">context_off vs baseline: exact-match accuracy -42.1 pp; wrong-code rate +0.0 pp; unnecessary-question rate +0.0 pp; ambiguity recall -33.3 pp; context-resolution accuracy -53.3 pp; safe-rejection rate +0.0 pp.</w:t>
       </w:r>
     </w:p>
     <w:p>
@@ -9320,14 +11395,41 @@
         <w:spacing w:after="60"/>
       </w:pPr>
       <w:r>
-        <w:rPr>
-          <w:b/>
-          <w:bCs/>
-        </w:rPr>
-        <w:t xml:space="preserve">N4 suggestion usefulness is 0/13.</w:t>
-      </w:r>
-      <w:r>
-        <w:t xml:space="preserve"> For none of the 13 rejected paraphrases with a known meaning did N4 offer any suggestion. Usefulness was judged automatically (the suggestion must compile to the gold code), not manually as the plan intended.</w:t>
+        <w:t xml:space="preserve">forced_top1 vs baseline: exact-match accuracy +0.0 pp; wrong-code rate +8.0 pp; unnecessary-question rate +0.0 pp; ambiguity recall -66.7 pp; context-resolution accuracy +0.0 pp; safe-rejection rate +0.0 pp.</w:t>
+      </w:r>
+    </w:p>
+    <w:p>
+      <w:pPr>
+        <w:spacing w:after="120"/>
+        <w:jc w:val="both"/>
+      </w:pPr>
+      <w:r>
+        <w:t xml:space="preserve">No failures.</w:t>
+      </w:r>
+    </w:p>
+    <w:p>
+      <w:pPr>
+        <w:pStyle w:val="Heading2"/>
+      </w:pPr>
+      <w:r>
+        <w:t xml:space="preserve">8.8 Development fixtures (sanity check)</w:t>
+      </w:r>
+    </w:p>
+    <w:p>
+      <w:pPr>
+        <w:spacing w:after="120"/>
+        <w:jc w:val="both"/>
+      </w:pPr>
+      <w:r>
+        <w:t xml:space="preserve">On the development fixtures, which the system was built against, every metric was at its best value at baseline (for example exact match 23/23 and ambiguity recall 17/17). The ablations moved in the same direction as on the held-out set: exact match fell to 11/23 (47.8%) with N1 off, and wrong code rose to 11/62 (17.7%) under forced top-1. These numbers are not evidence; they only confirm that the runner and the system agree with the tests.</w:t>
+      </w:r>
+    </w:p>
+    <w:p>
+      <w:pPr>
+        <w:pStyle w:val="Heading1"/>
+      </w:pPr>
+      <w:r>
+        <w:t xml:space="preserve">9. Limitations</w:t>
       </w:r>
     </w:p>
     <w:p>
@@ -9344,10 +11446,10 @@
           <w:b/>
           <w:bCs/>
         </w:rPr>
-        <w:t xml:space="preserve">V3 added no detections beyond V2 on this mutation set.</w:t>
-      </w:r>
-      <w:r>
-        <w:t xml:space="preserve"> Every mutant V3 caught, V2 also caught: 173 by both, 15 by V2 only, none by V3 only. The set contains no mutant that V2 misses, so it does not show what V3 adds. V3 is meant for bugs that a shared parser and code generator would hide from V2, and none are modelled here.</w:t>
+        <w:t xml:space="preserve">Paraphrase consistency is 1/15 groups</w:t>
+      </w:r>
+      <w:r>
+        <w:t xml:space="preserve">, both for "all members give the same AST" and for "all members give the gold AST". In 13 groups the out-of-coverage phrasing is rejected, and one paraphrase ends in a semantic error. Per input, 46 of 60 paraphrases (76.7%) match.</w:t>
       </w:r>
     </w:p>
     <w:p>
@@ -9364,10 +11466,10 @@
           <w:b/>
           <w:bCs/>
         </w:rPr>
-        <w:t xml:space="preserve">Data provenance.</w:t>
-      </w:r>
-      <w:r>
-        <w:t xml:space="preserve"> The ambiguous, unsupported and session subsets were written with AI assistance in this repository by an author with compiler-integration and development-fixture context, so they may share the system's phrasing; their perfect scores should be read with that in mind. The paraphrase set was written before its author saw the pattern table and is the stronger evidence, but it is also AI-assisted and has not been independently reviewed by a human. The human blind set (Section 8.7) is meant to close this gap.</w:t>
+        <w:t xml:space="preserve">N4 suggestion usefulness is 0/13.</w:t>
+      </w:r>
+      <w:r>
+        <w:t xml:space="preserve"> For none of the 13 rejected paraphrases with a known meaning did N4 offer any suggestion. Usefulness was judged automatically (the suggestion must compile to the gold code), not manually as the plan intended.</w:t>
       </w:r>
     </w:p>
     <w:p>
@@ -9384,10 +11486,10 @@
           <w:b/>
           <w:bCs/>
         </w:rPr>
-        <w:t xml:space="preserve">Gaps against the plan.</w:t>
-      </w:r>
-      <w:r>
-        <w:t xml:space="preserve"> There is no held-out subset of about 50 valid single statements (the paraphrases stand in), and the held-out unsupported inputs include no semantic errors.</w:t>
+        <w:t xml:space="preserve">V3 added no detections beyond V2 on this mutation set.</w:t>
+      </w:r>
+      <w:r>
+        <w:t xml:space="preserve"> Every mutant V3 caught, V2 also caught: 173 by both, 15 by V2 only, none by V3 only. The set contains no mutant that V2 misses, so it does not show what V3 adds. V3 is meant for bugs that a shared parser and code generator would hide from V2, and none are modelled here.</w:t>
       </w:r>
     </w:p>
     <w:p>
@@ -9404,10 +11506,10 @@
           <w:b/>
           <w:bCs/>
         </w:rPr>
-        <w:t xml:space="preserve">Small samples.</w:t>
-      </w:r>
-      <w:r>
-        <w:t xml:space="preserve"> The held-out set has 168 inputs and one deterministic run, so the numbers carry wide uncertainty; no confidence intervals are reported.</w:t>
+        <w:t xml:space="preserve">Data provenance.</w:t>
+      </w:r>
+      <w:r>
+        <w:t xml:space="preserve"> The ambiguous, unsupported and session subsets were written with AI assistance in this repository by an author with compiler-integration and development-fixture context, so they may share the system's phrasing; their perfect scores should be read with that in mind. The paraphrase set was written before its author saw the pattern table and is the stronger evidence, but it is also AI-assisted and has not been independently reviewed by a human.</w:t>
       </w:r>
     </w:p>
     <w:p>
@@ -9424,18 +11526,10 @@
           <w:b/>
           <w:bCs/>
         </w:rPr>
-        <w:t xml:space="preserve">Scope.</w:t>
-      </w:r>
-      <w:r>
-        <w:t xml:space="preserve"> Input is constrained English, and MiniLang has no functions, lists or user input. Verification checks against defined checks; it does not prove an interpretation correct.</w:t>
-      </w:r>
-    </w:p>
-    <w:p>
-      <w:pPr>
-        <w:pStyle w:val="Heading1"/>
-      </w:pPr>
-      <w:r>
-        <w:t xml:space="preserve">10. Team contributions</w:t>
+        <w:t xml:space="preserve">No human-authored blind set.</w:t>
+      </w:r>
+      <w:r>
+        <w:t xml:space="preserve"> No independently human-authored held-out set was collected. The synthetic blind set (Section 8.7) was written by the same AI agent that helped build the system, so it may share the system's phrasing; its perfect baseline score is weak evidence of generalisation.</w:t>
       </w:r>
     </w:p>
     <w:p>
@@ -9452,10 +11546,10 @@
           <w:b/>
           <w:bCs/>
         </w:rPr>
-        <w:t xml:space="preserve">Ashwin Lakshminarasimhan.</w:t>
-      </w:r>
-      <w:r>
-        <w:t xml:space="preserve"> Core pipeline and integration, Phases 0 to 6: project setup, language specification and data contracts, the NLP front end (normalizer, pattern table, candidate generator), IR builder, semantic analysis and session, code generation and back-translation (V1), the CLI, the context resolver (N1) and the ambiguity gate (N2). Integration of the verifier layers into the pipeline and the V3 and N4 fixes. The evaluation (N5): runner, metrics and ablations, and the mutation operators and mutation-detection evaluation.</w:t>
+        <w:t xml:space="preserve">Gaps against the plan.</w:t>
+      </w:r>
+      <w:r>
+        <w:t xml:space="preserve"> There is no held-out subset of about 50 valid single statements (the paraphrases stand in), and the held-out unsupported inputs include no semantic errors.</w:t>
       </w:r>
     </w:p>
     <w:p>
@@ -9472,10 +11566,10 @@
           <w:b/>
           <w:bCs/>
         </w:rPr>
-        <w:t xml:space="preserve">Aditya Kishor.</w:t>
-      </w:r>
-      <w:r>
-        <w:t xml:space="preserve"> Suggestions (N4); the test suites for the lexer, parser and verifiers, including the verifier mutation tests; the held-out paraphrase set; the demonstration script and presenter guide.</w:t>
+        <w:t xml:space="preserve">Small samples.</w:t>
+      </w:r>
+      <w:r>
+        <w:t xml:space="preserve"> The held-out set has 168 inputs and one deterministic run, so the numbers carry wide uncertainty; no confidence intervals are reported.</w:t>
       </w:r>
     </w:p>
     <w:p>
@@ -9492,10 +11586,78 @@
           <w:b/>
           <w:bCs/>
         </w:rPr>
+        <w:t xml:space="preserve">Scope.</w:t>
+      </w:r>
+      <w:r>
+        <w:t xml:space="preserve"> Input is constrained English, and MiniLang has no functions, lists or user input. Verification checks against defined checks; it does not prove an interpretation correct.</w:t>
+      </w:r>
+    </w:p>
+    <w:p>
+      <w:pPr>
+        <w:pStyle w:val="Heading1"/>
+      </w:pPr>
+      <w:r>
+        <w:t xml:space="preserve">10. Team contributions</w:t>
+      </w:r>
+    </w:p>
+    <w:p>
+      <w:pPr>
+        <w:pStyle w:val="ListParagraph"/>
+        <w:numPr>
+          <w:ilvl w:val="0"/>
+          <w:numId w:val="3"/>
+        </w:numPr>
+        <w:spacing w:after="60"/>
+      </w:pPr>
+      <w:r>
+        <w:rPr>
+          <w:b/>
+          <w:bCs/>
+        </w:rPr>
+        <w:t xml:space="preserve">Ashwin Lakshminarasimhan.</w:t>
+      </w:r>
+      <w:r>
+        <w:t xml:space="preserve"> Core pipeline and integration, Phases 0 to 6: project setup, language specification and data contracts, the NLP front end (normalizer, pattern table, candidate generator), IR builder, semantic analysis and session, code generation and back-translation (V1), the CLI, the context resolver (N1) and the ambiguity gate (N2). Integration of the verifier layers into the pipeline and the V3 and N4 fixes. The evaluation (N5): runner, metrics and ablations, and the mutation operators and mutation-detection evaluation.</w:t>
+      </w:r>
+    </w:p>
+    <w:p>
+      <w:pPr>
+        <w:pStyle w:val="ListParagraph"/>
+        <w:numPr>
+          <w:ilvl w:val="0"/>
+          <w:numId w:val="3"/>
+        </w:numPr>
+        <w:spacing w:after="60"/>
+      </w:pPr>
+      <w:r>
+        <w:rPr>
+          <w:b/>
+          <w:bCs/>
+        </w:rPr>
+        <w:t xml:space="preserve">Aditya Kishor.</w:t>
+      </w:r>
+      <w:r>
+        <w:t xml:space="preserve"> Suggestions (N4); the test suites for the lexer, parser and verifiers, including the verifier mutation tests; the held-out paraphrase set; the demonstration script and presenter guide.</w:t>
+      </w:r>
+    </w:p>
+    <w:p>
+      <w:pPr>
+        <w:pStyle w:val="ListParagraph"/>
+        <w:numPr>
+          <w:ilvl w:val="0"/>
+          <w:numId w:val="3"/>
+        </w:numPr>
+        <w:spacing w:after="60"/>
+      </w:pPr>
+      <w:r>
+        <w:rPr>
+          <w:b/>
+          <w:bCs/>
+        </w:rPr>
         <w:t xml:space="preserve">Maheep Singh.</w:t>
       </w:r>
       <w:r>
-        <w:t xml:space="preserve"> Lexer and parser, round-trip check (V2), interpreter and AST evaluator (V3), and the human blind test set (pending).</w:t>
+        <w:t xml:space="preserve"> Lexer and parser, round-trip check (V2), interpreter and AST evaluator (V3).</w:t>
       </w:r>
     </w:p>
     <w:p>
@@ -9538,7 +11700,7 @@
         <w:spacing w:after="60"/>
       </w:pPr>
       <w:r>
-        <w:t xml:space="preserve">Run the human blind set and report it next to the held-out results.</w:t>
+        <w:t xml:space="preserve">Collect an independently human-authored blind set and report it next to the held-out results.</w:t>
       </w:r>
     </w:p>
     <w:p>

</xml_diff>